<commit_message>
writeup: cleaned up qmd and word/pdf exports
</commit_message>
<xml_diff>
--- a/report/HDS_05_YuChungYan_2606.docx
+++ b/report/HDS_05_YuChungYan_2606.docx
@@ -38,15 +38,14 @@
     <w:p>
       <w:pPr>
         <w:pStyle w:val="FirstParagraph"/>
-        <w:jc w:val="center"/>
       </w:pPr>
       <w:r>
         <w:rPr>
           <w:noProof/>
         </w:rPr>
         <w:drawing>
-          <wp:inline distT="0" distB="0" distL="0" distR="0" wp14:anchorId="16989146" wp14:editId="26FF0370">
-            <wp:extent cx="2540000" cy="1032933"/>
+          <wp:inline distT="0" distB="0" distL="0" distR="0" wp14:anchorId="1E9CA8FD" wp14:editId="7B0BA1F0">
+            <wp:extent cx="5727700" cy="2329264"/>
             <wp:effectExtent l="0" t="0" r="0" b="0"/>
             <wp:docPr id="10" name="Picture"/>
             <wp:cNvGraphicFramePr/>
@@ -68,7 +67,7 @@
                   <pic:spPr bwMode="auto">
                     <a:xfrm>
                       <a:off x="0" y="0"/>
-                      <a:ext cx="2641218" cy="1074095"/>
+                      <a:ext cx="5727700" cy="2329264"/>
                     </a:xfrm>
                     <a:prstGeom prst="rect">
                       <a:avLst/>
@@ -380,6 +379,7 @@
       <w:bookmarkStart w:id="6" w:name="questions-for-reflection"/>
       <w:bookmarkEnd w:id="5"/>
       <w:r>
+        <w:lastRenderedPageBreak/>
         <w:t>Questions for reflection</w:t>
       </w:r>
     </w:p>
@@ -396,7 +396,6 @@
         <w:pStyle w:val="BodyText"/>
       </w:pPr>
       <w:r>
-        <w:lastRenderedPageBreak/>
         <w:t>For each of the questions, do not spend too long answering – keep it brief. For each question you answer, limit yourself to no more than three items. And please remember, this is optional and developmental: these cover sheets are designed to create space for self-assessment and feedback dialogue, rather than additional assignment workload.</w:t>
       </w:r>
     </w:p>
@@ -538,11 +537,6 @@
       </w:pPr>
       <w:bookmarkStart w:id="7" w:name="declaration-of-the-use-of-generative-ai"/>
       <w:bookmarkEnd w:id="6"/>
-    </w:p>
-    <w:p>
-      <w:pPr>
-        <w:pStyle w:val="Heading4"/>
-      </w:pPr>
       <w:r>
         <w:t>Declaration of the use of generative AI</w:t>
       </w:r>
@@ -637,7 +631,7 @@
               <w:pStyle w:val="Compact"/>
             </w:pPr>
             <w:r>
-              <w:t>Code generation, informed feedback, note curation and semantic search</w:t>
+              <w:t>Code generation, informed feedback, note curation and semantic search, reference curation</w:t>
             </w:r>
           </w:p>
         </w:tc>
@@ -676,7 +670,6 @@
         <w:br w:type="page"/>
       </w:r>
     </w:p>
-    <w:p/>
     <w:p>
       <w:pPr>
         <w:pStyle w:val="Heading1"/>
@@ -686,6 +679,7 @@
       <w:bookmarkEnd w:id="1"/>
       <w:bookmarkEnd w:id="7"/>
       <w:r>
+        <w:lastRenderedPageBreak/>
         <w:t>Abstract</w:t>
       </w:r>
     </w:p>
@@ -958,8 +952,8 @@
                 <w:noProof/>
               </w:rPr>
               <w:drawing>
-                <wp:inline distT="0" distB="0" distL="0" distR="0" wp14:anchorId="76C33A39" wp14:editId="1896E6DE">
-                  <wp:extent cx="4618182" cy="5407458"/>
+                <wp:inline distT="0" distB="0" distL="0" distR="0" wp14:anchorId="08505E97" wp14:editId="3254A5F9">
+                  <wp:extent cx="4618182" cy="5407457"/>
                   <wp:effectExtent l="0" t="0" r="0" b="0"/>
                   <wp:docPr id="25" name="Picture"/>
                   <wp:cNvGraphicFramePr/>
@@ -981,7 +975,7 @@
                         <pic:spPr bwMode="auto">
                           <a:xfrm>
                             <a:off x="0" y="0"/>
-                            <a:ext cx="4643783" cy="5437434"/>
+                            <a:ext cx="4630441" cy="5421811"/>
                           </a:xfrm>
                           <a:prstGeom prst="rect">
                             <a:avLst/>
@@ -1029,7 +1023,7 @@
               </w:rPr>
               <w:lastRenderedPageBreak/>
               <w:drawing>
-                <wp:inline distT="0" distB="0" distL="0" distR="0" wp14:anchorId="489CCACB" wp14:editId="421C9DC5">
+                <wp:inline distT="0" distB="0" distL="0" distR="0" wp14:anchorId="337F6535" wp14:editId="395A768D">
                   <wp:extent cx="5727700" cy="6464597"/>
                   <wp:effectExtent l="0" t="0" r="0" b="0"/>
                   <wp:docPr id="29" name="Picture"/>
@@ -1397,6 +1391,18 @@
               <w:spacing w:before="200"/>
             </w:pPr>
             <w:bookmarkStart w:id="18" w:name="tbl-main"/>
+          </w:p>
+          <w:p>
+            <w:pPr>
+              <w:pStyle w:val="ImageCaption"/>
+              <w:spacing w:before="200"/>
+            </w:pPr>
+          </w:p>
+          <w:p>
+            <w:pPr>
+              <w:pStyle w:val="ImageCaption"/>
+              <w:spacing w:before="200"/>
+            </w:pPr>
             <w:r>
               <w:t>Table 1: Classification performance on the KU-Optofil test set (13-class). XGBoost and end-to-end fine-tuned models report macro F1 mean ± STD across 5 seeds; mean shown for weighted F1 and accuracy only as STD were all below 0.002. Best results among pretrained models are bold; fine-tuned models shown for comparison.</w:t>
             </w:r>
@@ -1422,7 +1428,10 @@
               </w:trPr>
               <w:tc>
                 <w:tcPr>
-                  <w:tcW w:w="1377" w:type="dxa"/>
+                  <w:tcW w:w="1570" w:type="dxa"/>
+                  <w:tcBorders>
+                    <w:bottom w:val="single" w:sz="12" w:space="0" w:color="auto"/>
+                  </w:tcBorders>
                 </w:tcPr>
                 <w:p>
                   <w:pPr>
@@ -1436,7 +1445,10 @@
               </w:tc>
               <w:tc>
                 <w:tcPr>
-                  <w:tcW w:w="1377" w:type="dxa"/>
+                  <w:tcW w:w="1570" w:type="dxa"/>
+                  <w:tcBorders>
+                    <w:bottom w:val="single" w:sz="12" w:space="0" w:color="auto"/>
+                  </w:tcBorders>
                 </w:tcPr>
                 <w:p>
                   <w:pPr>
@@ -1450,7 +1462,10 @@
               </w:tc>
               <w:tc>
                 <w:tcPr>
-                  <w:tcW w:w="1721" w:type="dxa"/>
+                  <w:tcW w:w="1962" w:type="dxa"/>
+                  <w:tcBorders>
+                    <w:bottom w:val="single" w:sz="12" w:space="0" w:color="auto"/>
+                  </w:tcBorders>
                 </w:tcPr>
                 <w:p>
                   <w:pPr>
@@ -1464,7 +1479,10 @@
               </w:tc>
               <w:tc>
                 <w:tcPr>
-                  <w:tcW w:w="1721" w:type="dxa"/>
+                  <w:tcW w:w="1962" w:type="dxa"/>
+                  <w:tcBorders>
+                    <w:bottom w:val="single" w:sz="12" w:space="0" w:color="auto"/>
+                  </w:tcBorders>
                 </w:tcPr>
                 <w:p>
                   <w:pPr>
@@ -1478,7 +1496,10 @@
               </w:tc>
               <w:tc>
                 <w:tcPr>
-                  <w:tcW w:w="1721" w:type="dxa"/>
+                  <w:tcW w:w="1962" w:type="dxa"/>
+                  <w:tcBorders>
+                    <w:bottom w:val="single" w:sz="12" w:space="0" w:color="auto"/>
+                  </w:tcBorders>
                 </w:tcPr>
                 <w:p>
                   <w:pPr>
@@ -1494,21 +1515,41 @@
             <w:tr>
               <w:tc>
                 <w:tcPr>
-                  <w:tcW w:w="1377" w:type="dxa"/>
-                </w:tcPr>
-                <w:p>
-                  <w:pPr>
-                    <w:pStyle w:val="Compact"/>
-                    <w:jc w:val="center"/>
-                  </w:pPr>
-                  <w:r>
-                    <w:t>DinoBloom-S (ViT)</w:t>
-                  </w:r>
-                </w:p>
-              </w:tc>
-              <w:tc>
-                <w:tcPr>
-                  <w:tcW w:w="1377" w:type="dxa"/>
+                  <w:tcW w:w="1570" w:type="dxa"/>
+                  <w:vMerge w:val="restart"/>
+                  <w:tcBorders>
+                    <w:top w:val="single" w:sz="12" w:space="0" w:color="auto"/>
+                  </w:tcBorders>
+                </w:tcPr>
+                <w:p>
+                  <w:pPr>
+                    <w:pStyle w:val="Compact"/>
+                    <w:jc w:val="center"/>
+                  </w:pPr>
+                  <w:proofErr w:type="spellStart"/>
+                  <w:r>
+                    <w:t>DinoBloom</w:t>
+                  </w:r>
+                  <w:proofErr w:type="spellEnd"/>
+                  <w:r>
+                    <w:t>-S (</w:t>
+                  </w:r>
+                  <w:proofErr w:type="spellStart"/>
+                  <w:r>
+                    <w:t>ViT</w:t>
+                  </w:r>
+                  <w:proofErr w:type="spellEnd"/>
+                  <w:r>
+                    <w:t>)</w:t>
+                  </w:r>
+                </w:p>
+              </w:tc>
+              <w:tc>
+                <w:tcPr>
+                  <w:tcW w:w="1570" w:type="dxa"/>
+                  <w:tcBorders>
+                    <w:top w:val="single" w:sz="12" w:space="0" w:color="auto"/>
+                  </w:tcBorders>
                 </w:tcPr>
                 <w:p>
                   <w:pPr>
@@ -1522,7 +1563,10 @@
               </w:tc>
               <w:tc>
                 <w:tcPr>
-                  <w:tcW w:w="1721" w:type="dxa"/>
+                  <w:tcW w:w="1962" w:type="dxa"/>
+                  <w:tcBorders>
+                    <w:top w:val="single" w:sz="12" w:space="0" w:color="auto"/>
+                  </w:tcBorders>
                 </w:tcPr>
                 <w:p>
                   <w:pPr>
@@ -1540,7 +1584,10 @@
               </w:tc>
               <w:tc>
                 <w:tcPr>
-                  <w:tcW w:w="1721" w:type="dxa"/>
+                  <w:tcW w:w="1962" w:type="dxa"/>
+                  <w:tcBorders>
+                    <w:top w:val="single" w:sz="12" w:space="0" w:color="auto"/>
+                  </w:tcBorders>
                 </w:tcPr>
                 <w:p>
                   <w:pPr>
@@ -1558,7 +1605,10 @@
               </w:tc>
               <w:tc>
                 <w:tcPr>
-                  <w:tcW w:w="1721" w:type="dxa"/>
+                  <w:tcW w:w="1962" w:type="dxa"/>
+                  <w:tcBorders>
+                    <w:top w:val="single" w:sz="12" w:space="0" w:color="auto"/>
+                  </w:tcBorders>
                 </w:tcPr>
                 <w:p>
                   <w:pPr>
@@ -1578,17 +1628,24 @@
             <w:tr>
               <w:tc>
                 <w:tcPr>
-                  <w:tcW w:w="1377" w:type="dxa"/>
-                </w:tcPr>
-                <w:p>
-                  <w:pPr>
-                    <w:pStyle w:val="Compact"/>
-                  </w:pPr>
-                </w:p>
-              </w:tc>
-              <w:tc>
-                <w:tcPr>
-                  <w:tcW w:w="1377" w:type="dxa"/>
+                  <w:tcW w:w="1570" w:type="dxa"/>
+                  <w:vMerge/>
+                  <w:tcBorders>
+                    <w:bottom w:val="single" w:sz="4" w:space="0" w:color="auto"/>
+                  </w:tcBorders>
+                </w:tcPr>
+                <w:p>
+                  <w:pPr>
+                    <w:pStyle w:val="Compact"/>
+                  </w:pPr>
+                </w:p>
+              </w:tc>
+              <w:tc>
+                <w:tcPr>
+                  <w:tcW w:w="1570" w:type="dxa"/>
+                  <w:tcBorders>
+                    <w:bottom w:val="single" w:sz="4" w:space="0" w:color="auto"/>
+                  </w:tcBorders>
                 </w:tcPr>
                 <w:p>
                   <w:pPr>
@@ -1602,7 +1659,10 @@
               </w:tc>
               <w:tc>
                 <w:tcPr>
-                  <w:tcW w:w="1721" w:type="dxa"/>
+                  <w:tcW w:w="1962" w:type="dxa"/>
+                  <w:tcBorders>
+                    <w:bottom w:val="single" w:sz="4" w:space="0" w:color="auto"/>
+                  </w:tcBorders>
                 </w:tcPr>
                 <w:p>
                   <w:pPr>
@@ -1616,7 +1676,10 @@
               </w:tc>
               <w:tc>
                 <w:tcPr>
-                  <w:tcW w:w="1721" w:type="dxa"/>
+                  <w:tcW w:w="1962" w:type="dxa"/>
+                  <w:tcBorders>
+                    <w:bottom w:val="single" w:sz="4" w:space="0" w:color="auto"/>
+                  </w:tcBorders>
                 </w:tcPr>
                 <w:p>
                   <w:pPr>
@@ -1630,7 +1693,10 @@
               </w:tc>
               <w:tc>
                 <w:tcPr>
-                  <w:tcW w:w="1721" w:type="dxa"/>
+                  <w:tcW w:w="1962" w:type="dxa"/>
+                  <w:tcBorders>
+                    <w:bottom w:val="single" w:sz="4" w:space="0" w:color="auto"/>
+                  </w:tcBorders>
                 </w:tcPr>
                 <w:p>
                   <w:pPr>
@@ -1646,7 +1712,11 @@
             <w:tr>
               <w:tc>
                 <w:tcPr>
-                  <w:tcW w:w="1377" w:type="dxa"/>
+                  <w:tcW w:w="1570" w:type="dxa"/>
+                  <w:vMerge w:val="restart"/>
+                  <w:tcBorders>
+                    <w:top w:val="single" w:sz="4" w:space="0" w:color="auto"/>
+                  </w:tcBorders>
                 </w:tcPr>
                 <w:p>
                   <w:pPr>
@@ -1660,7 +1730,10 @@
               </w:tc>
               <w:tc>
                 <w:tcPr>
-                  <w:tcW w:w="1377" w:type="dxa"/>
+                  <w:tcW w:w="1570" w:type="dxa"/>
+                  <w:tcBorders>
+                    <w:top w:val="single" w:sz="4" w:space="0" w:color="auto"/>
+                  </w:tcBorders>
                 </w:tcPr>
                 <w:p>
                   <w:pPr>
@@ -1674,7 +1747,10 @@
               </w:tc>
               <w:tc>
                 <w:tcPr>
-                  <w:tcW w:w="1721" w:type="dxa"/>
+                  <w:tcW w:w="1962" w:type="dxa"/>
+                  <w:tcBorders>
+                    <w:top w:val="single" w:sz="4" w:space="0" w:color="auto"/>
+                  </w:tcBorders>
                 </w:tcPr>
                 <w:p>
                   <w:pPr>
@@ -1688,7 +1764,10 @@
               </w:tc>
               <w:tc>
                 <w:tcPr>
-                  <w:tcW w:w="1721" w:type="dxa"/>
+                  <w:tcW w:w="1962" w:type="dxa"/>
+                  <w:tcBorders>
+                    <w:top w:val="single" w:sz="4" w:space="0" w:color="auto"/>
+                  </w:tcBorders>
                 </w:tcPr>
                 <w:p>
                   <w:pPr>
@@ -1702,7 +1781,10 @@
               </w:tc>
               <w:tc>
                 <w:tcPr>
-                  <w:tcW w:w="1721" w:type="dxa"/>
+                  <w:tcW w:w="1962" w:type="dxa"/>
+                  <w:tcBorders>
+                    <w:top w:val="single" w:sz="4" w:space="0" w:color="auto"/>
+                  </w:tcBorders>
                 </w:tcPr>
                 <w:p>
                   <w:pPr>
@@ -1718,17 +1800,24 @@
             <w:tr>
               <w:tc>
                 <w:tcPr>
-                  <w:tcW w:w="1377" w:type="dxa"/>
-                </w:tcPr>
-                <w:p>
-                  <w:pPr>
-                    <w:pStyle w:val="Compact"/>
-                  </w:pPr>
-                </w:p>
-              </w:tc>
-              <w:tc>
-                <w:tcPr>
-                  <w:tcW w:w="1377" w:type="dxa"/>
+                  <w:tcW w:w="1570" w:type="dxa"/>
+                  <w:vMerge/>
+                  <w:tcBorders>
+                    <w:bottom w:val="single" w:sz="4" w:space="0" w:color="auto"/>
+                  </w:tcBorders>
+                </w:tcPr>
+                <w:p>
+                  <w:pPr>
+                    <w:pStyle w:val="Compact"/>
+                  </w:pPr>
+                </w:p>
+              </w:tc>
+              <w:tc>
+                <w:tcPr>
+                  <w:tcW w:w="1570" w:type="dxa"/>
+                  <w:tcBorders>
+                    <w:bottom w:val="single" w:sz="4" w:space="0" w:color="auto"/>
+                  </w:tcBorders>
                 </w:tcPr>
                 <w:p>
                   <w:pPr>
@@ -1742,7 +1831,10 @@
               </w:tc>
               <w:tc>
                 <w:tcPr>
-                  <w:tcW w:w="1721" w:type="dxa"/>
+                  <w:tcW w:w="1962" w:type="dxa"/>
+                  <w:tcBorders>
+                    <w:bottom w:val="single" w:sz="4" w:space="0" w:color="auto"/>
+                  </w:tcBorders>
                 </w:tcPr>
                 <w:p>
                   <w:pPr>
@@ -1756,7 +1848,10 @@
               </w:tc>
               <w:tc>
                 <w:tcPr>
-                  <w:tcW w:w="1721" w:type="dxa"/>
+                  <w:tcW w:w="1962" w:type="dxa"/>
+                  <w:tcBorders>
+                    <w:bottom w:val="single" w:sz="4" w:space="0" w:color="auto"/>
+                  </w:tcBorders>
                 </w:tcPr>
                 <w:p>
                   <w:pPr>
@@ -1770,7 +1865,10 @@
               </w:tc>
               <w:tc>
                 <w:tcPr>
-                  <w:tcW w:w="1721" w:type="dxa"/>
+                  <w:tcW w:w="1962" w:type="dxa"/>
+                  <w:tcBorders>
+                    <w:bottom w:val="single" w:sz="4" w:space="0" w:color="auto"/>
+                  </w:tcBorders>
                 </w:tcPr>
                 <w:p>
                   <w:pPr>
@@ -1786,21 +1884,36 @@
             <w:tr>
               <w:tc>
                 <w:tcPr>
-                  <w:tcW w:w="1377" w:type="dxa"/>
-                </w:tcPr>
-                <w:p>
-                  <w:pPr>
-                    <w:pStyle w:val="Compact"/>
-                    <w:jc w:val="center"/>
-                  </w:pPr>
-                  <w:r>
-                    <w:t>Handcrafted (CellPose)</w:t>
-                  </w:r>
-                </w:p>
-              </w:tc>
-              <w:tc>
-                <w:tcPr>
-                  <w:tcW w:w="1377" w:type="dxa"/>
+                  <w:tcW w:w="1570" w:type="dxa"/>
+                  <w:vMerge w:val="restart"/>
+                  <w:tcBorders>
+                    <w:top w:val="single" w:sz="4" w:space="0" w:color="auto"/>
+                  </w:tcBorders>
+                </w:tcPr>
+                <w:p>
+                  <w:pPr>
+                    <w:pStyle w:val="Compact"/>
+                    <w:jc w:val="center"/>
+                  </w:pPr>
+                  <w:r>
+                    <w:t>Handcrafted (</w:t>
+                  </w:r>
+                  <w:proofErr w:type="spellStart"/>
+                  <w:r>
+                    <w:t>CellPose</w:t>
+                  </w:r>
+                  <w:proofErr w:type="spellEnd"/>
+                  <w:r>
+                    <w:t>)</w:t>
+                  </w:r>
+                </w:p>
+              </w:tc>
+              <w:tc>
+                <w:tcPr>
+                  <w:tcW w:w="1570" w:type="dxa"/>
+                  <w:tcBorders>
+                    <w:top w:val="single" w:sz="4" w:space="0" w:color="auto"/>
+                  </w:tcBorders>
                 </w:tcPr>
                 <w:p>
                   <w:pPr>
@@ -1814,7 +1927,10 @@
               </w:tc>
               <w:tc>
                 <w:tcPr>
-                  <w:tcW w:w="1721" w:type="dxa"/>
+                  <w:tcW w:w="1962" w:type="dxa"/>
+                  <w:tcBorders>
+                    <w:top w:val="single" w:sz="4" w:space="0" w:color="auto"/>
+                  </w:tcBorders>
                 </w:tcPr>
                 <w:p>
                   <w:pPr>
@@ -1828,7 +1944,10 @@
               </w:tc>
               <w:tc>
                 <w:tcPr>
-                  <w:tcW w:w="1721" w:type="dxa"/>
+                  <w:tcW w:w="1962" w:type="dxa"/>
+                  <w:tcBorders>
+                    <w:top w:val="single" w:sz="4" w:space="0" w:color="auto"/>
+                  </w:tcBorders>
                 </w:tcPr>
                 <w:p>
                   <w:pPr>
@@ -1842,7 +1961,10 @@
               </w:tc>
               <w:tc>
                 <w:tcPr>
-                  <w:tcW w:w="1721" w:type="dxa"/>
+                  <w:tcW w:w="1962" w:type="dxa"/>
+                  <w:tcBorders>
+                    <w:top w:val="single" w:sz="4" w:space="0" w:color="auto"/>
+                  </w:tcBorders>
                 </w:tcPr>
                 <w:p>
                   <w:pPr>
@@ -1858,17 +1980,24 @@
             <w:tr>
               <w:tc>
                 <w:tcPr>
-                  <w:tcW w:w="1377" w:type="dxa"/>
-                </w:tcPr>
-                <w:p>
-                  <w:pPr>
-                    <w:pStyle w:val="Compact"/>
-                  </w:pPr>
-                </w:p>
-              </w:tc>
-              <w:tc>
-                <w:tcPr>
-                  <w:tcW w:w="1377" w:type="dxa"/>
+                  <w:tcW w:w="1570" w:type="dxa"/>
+                  <w:vMerge/>
+                  <w:tcBorders>
+                    <w:bottom w:val="single" w:sz="4" w:space="0" w:color="auto"/>
+                  </w:tcBorders>
+                </w:tcPr>
+                <w:p>
+                  <w:pPr>
+                    <w:pStyle w:val="Compact"/>
+                  </w:pPr>
+                </w:p>
+              </w:tc>
+              <w:tc>
+                <w:tcPr>
+                  <w:tcW w:w="1570" w:type="dxa"/>
+                  <w:tcBorders>
+                    <w:bottom w:val="single" w:sz="4" w:space="0" w:color="auto"/>
+                  </w:tcBorders>
                 </w:tcPr>
                 <w:p>
                   <w:pPr>
@@ -1882,7 +2011,10 @@
               </w:tc>
               <w:tc>
                 <w:tcPr>
-                  <w:tcW w:w="1721" w:type="dxa"/>
+                  <w:tcW w:w="1962" w:type="dxa"/>
+                  <w:tcBorders>
+                    <w:bottom w:val="single" w:sz="4" w:space="0" w:color="auto"/>
+                  </w:tcBorders>
                 </w:tcPr>
                 <w:p>
                   <w:pPr>
@@ -1896,7 +2028,10 @@
               </w:tc>
               <w:tc>
                 <w:tcPr>
-                  <w:tcW w:w="1721" w:type="dxa"/>
+                  <w:tcW w:w="1962" w:type="dxa"/>
+                  <w:tcBorders>
+                    <w:bottom w:val="single" w:sz="4" w:space="0" w:color="auto"/>
+                  </w:tcBorders>
                 </w:tcPr>
                 <w:p>
                   <w:pPr>
@@ -1910,7 +2045,10 @@
               </w:tc>
               <w:tc>
                 <w:tcPr>
-                  <w:tcW w:w="1721" w:type="dxa"/>
+                  <w:tcW w:w="1962" w:type="dxa"/>
+                  <w:tcBorders>
+                    <w:bottom w:val="single" w:sz="4" w:space="0" w:color="auto"/>
+                  </w:tcBorders>
                 </w:tcPr>
                 <w:p>
                   <w:pPr>
@@ -1926,7 +2064,11 @@
             <w:tr>
               <w:tc>
                 <w:tcPr>
-                  <w:tcW w:w="1377" w:type="dxa"/>
+                  <w:tcW w:w="1570" w:type="dxa"/>
+                  <w:vMerge w:val="restart"/>
+                  <w:tcBorders>
+                    <w:top w:val="single" w:sz="4" w:space="0" w:color="auto"/>
+                  </w:tcBorders>
                 </w:tcPr>
                 <w:p>
                   <w:pPr>
@@ -1940,7 +2082,10 @@
               </w:tc>
               <w:tc>
                 <w:tcPr>
-                  <w:tcW w:w="1377" w:type="dxa"/>
+                  <w:tcW w:w="1570" w:type="dxa"/>
+                  <w:tcBorders>
+                    <w:top w:val="single" w:sz="4" w:space="0" w:color="auto"/>
+                  </w:tcBorders>
                 </w:tcPr>
                 <w:p>
                   <w:pPr>
@@ -1954,7 +2099,10 @@
               </w:tc>
               <w:tc>
                 <w:tcPr>
-                  <w:tcW w:w="1721" w:type="dxa"/>
+                  <w:tcW w:w="1962" w:type="dxa"/>
+                  <w:tcBorders>
+                    <w:top w:val="single" w:sz="4" w:space="0" w:color="auto"/>
+                  </w:tcBorders>
                 </w:tcPr>
                 <w:p>
                   <w:pPr>
@@ -1968,7 +2116,10 @@
               </w:tc>
               <w:tc>
                 <w:tcPr>
-                  <w:tcW w:w="1721" w:type="dxa"/>
+                  <w:tcW w:w="1962" w:type="dxa"/>
+                  <w:tcBorders>
+                    <w:top w:val="single" w:sz="4" w:space="0" w:color="auto"/>
+                  </w:tcBorders>
                 </w:tcPr>
                 <w:p>
                   <w:pPr>
@@ -1982,7 +2133,10 @@
               </w:tc>
               <w:tc>
                 <w:tcPr>
-                  <w:tcW w:w="1721" w:type="dxa"/>
+                  <w:tcW w:w="1962" w:type="dxa"/>
+                  <w:tcBorders>
+                    <w:top w:val="single" w:sz="4" w:space="0" w:color="auto"/>
+                  </w:tcBorders>
                 </w:tcPr>
                 <w:p>
                   <w:pPr>
@@ -1998,17 +2152,24 @@
             <w:tr>
               <w:tc>
                 <w:tcPr>
-                  <w:tcW w:w="1377" w:type="dxa"/>
-                </w:tcPr>
-                <w:p>
-                  <w:pPr>
-                    <w:pStyle w:val="Compact"/>
-                  </w:pPr>
-                </w:p>
-              </w:tc>
-              <w:tc>
-                <w:tcPr>
-                  <w:tcW w:w="1377" w:type="dxa"/>
+                  <w:tcW w:w="1570" w:type="dxa"/>
+                  <w:vMerge/>
+                  <w:tcBorders>
+                    <w:bottom w:val="single" w:sz="4" w:space="0" w:color="auto"/>
+                  </w:tcBorders>
+                </w:tcPr>
+                <w:p>
+                  <w:pPr>
+                    <w:pStyle w:val="Compact"/>
+                  </w:pPr>
+                </w:p>
+              </w:tc>
+              <w:tc>
+                <w:tcPr>
+                  <w:tcW w:w="1570" w:type="dxa"/>
+                  <w:tcBorders>
+                    <w:bottom w:val="single" w:sz="4" w:space="0" w:color="auto"/>
+                  </w:tcBorders>
                 </w:tcPr>
                 <w:p>
                   <w:pPr>
@@ -2022,7 +2183,10 @@
               </w:tc>
               <w:tc>
                 <w:tcPr>
-                  <w:tcW w:w="1721" w:type="dxa"/>
+                  <w:tcW w:w="1962" w:type="dxa"/>
+                  <w:tcBorders>
+                    <w:bottom w:val="single" w:sz="4" w:space="0" w:color="auto"/>
+                  </w:tcBorders>
                 </w:tcPr>
                 <w:p>
                   <w:pPr>
@@ -2036,7 +2200,10 @@
               </w:tc>
               <w:tc>
                 <w:tcPr>
-                  <w:tcW w:w="1721" w:type="dxa"/>
+                  <w:tcW w:w="1962" w:type="dxa"/>
+                  <w:tcBorders>
+                    <w:bottom w:val="single" w:sz="4" w:space="0" w:color="auto"/>
+                  </w:tcBorders>
                 </w:tcPr>
                 <w:p>
                   <w:pPr>
@@ -2050,7 +2217,10 @@
               </w:tc>
               <w:tc>
                 <w:tcPr>
-                  <w:tcW w:w="1721" w:type="dxa"/>
+                  <w:tcW w:w="1962" w:type="dxa"/>
+                  <w:tcBorders>
+                    <w:bottom w:val="single" w:sz="4" w:space="0" w:color="auto"/>
+                  </w:tcBorders>
                 </w:tcPr>
                 <w:p>
                   <w:pPr>
@@ -2066,21 +2236,41 @@
             <w:tr>
               <w:tc>
                 <w:tcPr>
-                  <w:tcW w:w="1377" w:type="dxa"/>
-                </w:tcPr>
-                <w:p>
-                  <w:pPr>
-                    <w:pStyle w:val="Compact"/>
-                    <w:jc w:val="center"/>
-                  </w:pPr>
-                  <w:r>
-                    <w:t>ViT-S/16 (ViT)</w:t>
-                  </w:r>
-                </w:p>
-              </w:tc>
-              <w:tc>
-                <w:tcPr>
-                  <w:tcW w:w="1377" w:type="dxa"/>
+                  <w:tcW w:w="1570" w:type="dxa"/>
+                  <w:vMerge w:val="restart"/>
+                  <w:tcBorders>
+                    <w:top w:val="single" w:sz="4" w:space="0" w:color="auto"/>
+                  </w:tcBorders>
+                </w:tcPr>
+                <w:p>
+                  <w:pPr>
+                    <w:pStyle w:val="Compact"/>
+                    <w:jc w:val="center"/>
+                  </w:pPr>
+                  <w:proofErr w:type="spellStart"/>
+                  <w:r>
+                    <w:t>ViT</w:t>
+                  </w:r>
+                  <w:proofErr w:type="spellEnd"/>
+                  <w:r>
+                    <w:t>-S/16 (</w:t>
+                  </w:r>
+                  <w:proofErr w:type="spellStart"/>
+                  <w:r>
+                    <w:t>ViT</w:t>
+                  </w:r>
+                  <w:proofErr w:type="spellEnd"/>
+                  <w:r>
+                    <w:t>)</w:t>
+                  </w:r>
+                </w:p>
+              </w:tc>
+              <w:tc>
+                <w:tcPr>
+                  <w:tcW w:w="1570" w:type="dxa"/>
+                  <w:tcBorders>
+                    <w:top w:val="single" w:sz="4" w:space="0" w:color="auto"/>
+                  </w:tcBorders>
                 </w:tcPr>
                 <w:p>
                   <w:pPr>
@@ -2094,7 +2284,10 @@
               </w:tc>
               <w:tc>
                 <w:tcPr>
-                  <w:tcW w:w="1721" w:type="dxa"/>
+                  <w:tcW w:w="1962" w:type="dxa"/>
+                  <w:tcBorders>
+                    <w:top w:val="single" w:sz="4" w:space="0" w:color="auto"/>
+                  </w:tcBorders>
                 </w:tcPr>
                 <w:p>
                   <w:pPr>
@@ -2108,7 +2301,10 @@
               </w:tc>
               <w:tc>
                 <w:tcPr>
-                  <w:tcW w:w="1721" w:type="dxa"/>
+                  <w:tcW w:w="1962" w:type="dxa"/>
+                  <w:tcBorders>
+                    <w:top w:val="single" w:sz="4" w:space="0" w:color="auto"/>
+                  </w:tcBorders>
                 </w:tcPr>
                 <w:p>
                   <w:pPr>
@@ -2122,7 +2318,10 @@
               </w:tc>
               <w:tc>
                 <w:tcPr>
-                  <w:tcW w:w="1721" w:type="dxa"/>
+                  <w:tcW w:w="1962" w:type="dxa"/>
+                  <w:tcBorders>
+                    <w:top w:val="single" w:sz="4" w:space="0" w:color="auto"/>
+                  </w:tcBorders>
                 </w:tcPr>
                 <w:p>
                   <w:pPr>
@@ -2138,17 +2337,24 @@
             <w:tr>
               <w:tc>
                 <w:tcPr>
-                  <w:tcW w:w="1377" w:type="dxa"/>
-                </w:tcPr>
-                <w:p>
-                  <w:pPr>
-                    <w:pStyle w:val="Compact"/>
-                  </w:pPr>
-                </w:p>
-              </w:tc>
-              <w:tc>
-                <w:tcPr>
-                  <w:tcW w:w="1377" w:type="dxa"/>
+                  <w:tcW w:w="1570" w:type="dxa"/>
+                  <w:vMerge/>
+                  <w:tcBorders>
+                    <w:bottom w:val="single" w:sz="4" w:space="0" w:color="auto"/>
+                  </w:tcBorders>
+                </w:tcPr>
+                <w:p>
+                  <w:pPr>
+                    <w:pStyle w:val="Compact"/>
+                  </w:pPr>
+                </w:p>
+              </w:tc>
+              <w:tc>
+                <w:tcPr>
+                  <w:tcW w:w="1570" w:type="dxa"/>
+                  <w:tcBorders>
+                    <w:bottom w:val="single" w:sz="4" w:space="0" w:color="auto"/>
+                  </w:tcBorders>
                 </w:tcPr>
                 <w:p>
                   <w:pPr>
@@ -2162,7 +2368,10 @@
               </w:tc>
               <w:tc>
                 <w:tcPr>
-                  <w:tcW w:w="1721" w:type="dxa"/>
+                  <w:tcW w:w="1962" w:type="dxa"/>
+                  <w:tcBorders>
+                    <w:bottom w:val="single" w:sz="4" w:space="0" w:color="auto"/>
+                  </w:tcBorders>
                 </w:tcPr>
                 <w:p>
                   <w:pPr>
@@ -2176,7 +2385,10 @@
               </w:tc>
               <w:tc>
                 <w:tcPr>
-                  <w:tcW w:w="1721" w:type="dxa"/>
+                  <w:tcW w:w="1962" w:type="dxa"/>
+                  <w:tcBorders>
+                    <w:bottom w:val="single" w:sz="4" w:space="0" w:color="auto"/>
+                  </w:tcBorders>
                 </w:tcPr>
                 <w:p>
                   <w:pPr>
@@ -2190,7 +2402,10 @@
               </w:tc>
               <w:tc>
                 <w:tcPr>
-                  <w:tcW w:w="1721" w:type="dxa"/>
+                  <w:tcW w:w="1962" w:type="dxa"/>
+                  <w:tcBorders>
+                    <w:bottom w:val="single" w:sz="4" w:space="0" w:color="auto"/>
+                  </w:tcBorders>
                 </w:tcPr>
                 <w:p>
                   <w:pPr>
@@ -2206,7 +2421,11 @@
             <w:tr>
               <w:tc>
                 <w:tcPr>
-                  <w:tcW w:w="1377" w:type="dxa"/>
+                  <w:tcW w:w="1570" w:type="dxa"/>
+                  <w:vMerge w:val="restart"/>
+                  <w:tcBorders>
+                    <w:top w:val="single" w:sz="4" w:space="0" w:color="auto"/>
+                  </w:tcBorders>
                 </w:tcPr>
                 <w:p>
                   <w:pPr>
@@ -2220,7 +2439,10 @@
               </w:tc>
               <w:tc>
                 <w:tcPr>
-                  <w:tcW w:w="1377" w:type="dxa"/>
+                  <w:tcW w:w="1570" w:type="dxa"/>
+                  <w:tcBorders>
+                    <w:top w:val="single" w:sz="4" w:space="0" w:color="auto"/>
+                  </w:tcBorders>
                 </w:tcPr>
                 <w:p>
                   <w:pPr>
@@ -2234,7 +2456,10 @@
               </w:tc>
               <w:tc>
                 <w:tcPr>
-                  <w:tcW w:w="1721" w:type="dxa"/>
+                  <w:tcW w:w="1962" w:type="dxa"/>
+                  <w:tcBorders>
+                    <w:top w:val="single" w:sz="4" w:space="0" w:color="auto"/>
+                  </w:tcBorders>
                 </w:tcPr>
                 <w:p>
                   <w:pPr>
@@ -2248,7 +2473,10 @@
               </w:tc>
               <w:tc>
                 <w:tcPr>
-                  <w:tcW w:w="1721" w:type="dxa"/>
+                  <w:tcW w:w="1962" w:type="dxa"/>
+                  <w:tcBorders>
+                    <w:top w:val="single" w:sz="4" w:space="0" w:color="auto"/>
+                  </w:tcBorders>
                 </w:tcPr>
                 <w:p>
                   <w:pPr>
@@ -2262,7 +2490,10 @@
               </w:tc>
               <w:tc>
                 <w:tcPr>
-                  <w:tcW w:w="1721" w:type="dxa"/>
+                  <w:tcW w:w="1962" w:type="dxa"/>
+                  <w:tcBorders>
+                    <w:top w:val="single" w:sz="4" w:space="0" w:color="auto"/>
+                  </w:tcBorders>
                 </w:tcPr>
                 <w:p>
                   <w:pPr>
@@ -2278,17 +2509,24 @@
             <w:tr>
               <w:tc>
                 <w:tcPr>
-                  <w:tcW w:w="1377" w:type="dxa"/>
-                </w:tcPr>
-                <w:p>
-                  <w:pPr>
-                    <w:pStyle w:val="Compact"/>
-                  </w:pPr>
-                </w:p>
-              </w:tc>
-              <w:tc>
-                <w:tcPr>
-                  <w:tcW w:w="1377" w:type="dxa"/>
+                  <w:tcW w:w="1570" w:type="dxa"/>
+                  <w:vMerge/>
+                  <w:tcBorders>
+                    <w:bottom w:val="double" w:sz="4" w:space="0" w:color="auto"/>
+                  </w:tcBorders>
+                </w:tcPr>
+                <w:p>
+                  <w:pPr>
+                    <w:pStyle w:val="Compact"/>
+                  </w:pPr>
+                </w:p>
+              </w:tc>
+              <w:tc>
+                <w:tcPr>
+                  <w:tcW w:w="1570" w:type="dxa"/>
+                  <w:tcBorders>
+                    <w:bottom w:val="double" w:sz="4" w:space="0" w:color="auto"/>
+                  </w:tcBorders>
                 </w:tcPr>
                 <w:p>
                   <w:pPr>
@@ -2302,7 +2540,10 @@
               </w:tc>
               <w:tc>
                 <w:tcPr>
-                  <w:tcW w:w="1721" w:type="dxa"/>
+                  <w:tcW w:w="1962" w:type="dxa"/>
+                  <w:tcBorders>
+                    <w:bottom w:val="double" w:sz="4" w:space="0" w:color="auto"/>
+                  </w:tcBorders>
                 </w:tcPr>
                 <w:p>
                   <w:pPr>
@@ -2316,7 +2557,10 @@
               </w:tc>
               <w:tc>
                 <w:tcPr>
-                  <w:tcW w:w="1721" w:type="dxa"/>
+                  <w:tcW w:w="1962" w:type="dxa"/>
+                  <w:tcBorders>
+                    <w:bottom w:val="double" w:sz="4" w:space="0" w:color="auto"/>
+                  </w:tcBorders>
                 </w:tcPr>
                 <w:p>
                   <w:pPr>
@@ -2330,7 +2574,10 @@
               </w:tc>
               <w:tc>
                 <w:tcPr>
-                  <w:tcW w:w="1721" w:type="dxa"/>
+                  <w:tcW w:w="1962" w:type="dxa"/>
+                  <w:tcBorders>
+                    <w:bottom w:val="double" w:sz="4" w:space="0" w:color="auto"/>
+                  </w:tcBorders>
                 </w:tcPr>
                 <w:p>
                   <w:pPr>
@@ -2346,7 +2593,11 @@
             <w:tr>
               <w:tc>
                 <w:tcPr>
-                  <w:tcW w:w="1377" w:type="dxa"/>
+                  <w:tcW w:w="1570" w:type="dxa"/>
+                  <w:tcBorders>
+                    <w:top w:val="double" w:sz="4" w:space="0" w:color="auto"/>
+                    <w:bottom w:val="single" w:sz="12" w:space="0" w:color="auto"/>
+                  </w:tcBorders>
                 </w:tcPr>
                 <w:p>
                   <w:pPr>
@@ -2364,37 +2615,53 @@
               </w:tc>
               <w:tc>
                 <w:tcPr>
-                  <w:tcW w:w="1377" w:type="dxa"/>
-                </w:tcPr>
-                <w:p>
-                  <w:pPr>
-                    <w:pStyle w:val="Compact"/>
-                  </w:pPr>
-                </w:p>
-              </w:tc>
-              <w:tc>
-                <w:tcPr>
-                  <w:tcW w:w="1721" w:type="dxa"/>
-                </w:tcPr>
-                <w:p>
-                  <w:pPr>
-                    <w:pStyle w:val="Compact"/>
-                  </w:pPr>
-                </w:p>
-              </w:tc>
-              <w:tc>
-                <w:tcPr>
-                  <w:tcW w:w="1721" w:type="dxa"/>
-                </w:tcPr>
-                <w:p>
-                  <w:pPr>
-                    <w:pStyle w:val="Compact"/>
-                  </w:pPr>
-                </w:p>
-              </w:tc>
-              <w:tc>
-                <w:tcPr>
-                  <w:tcW w:w="1721" w:type="dxa"/>
+                  <w:tcW w:w="1570" w:type="dxa"/>
+                  <w:tcBorders>
+                    <w:top w:val="double" w:sz="4" w:space="0" w:color="auto"/>
+                    <w:bottom w:val="single" w:sz="12" w:space="0" w:color="auto"/>
+                  </w:tcBorders>
+                </w:tcPr>
+                <w:p>
+                  <w:pPr>
+                    <w:pStyle w:val="Compact"/>
+                  </w:pPr>
+                </w:p>
+              </w:tc>
+              <w:tc>
+                <w:tcPr>
+                  <w:tcW w:w="1962" w:type="dxa"/>
+                  <w:tcBorders>
+                    <w:top w:val="double" w:sz="4" w:space="0" w:color="auto"/>
+                    <w:bottom w:val="single" w:sz="12" w:space="0" w:color="auto"/>
+                  </w:tcBorders>
+                </w:tcPr>
+                <w:p>
+                  <w:pPr>
+                    <w:pStyle w:val="Compact"/>
+                  </w:pPr>
+                </w:p>
+              </w:tc>
+              <w:tc>
+                <w:tcPr>
+                  <w:tcW w:w="1962" w:type="dxa"/>
+                  <w:tcBorders>
+                    <w:top w:val="double" w:sz="4" w:space="0" w:color="auto"/>
+                    <w:bottom w:val="single" w:sz="12" w:space="0" w:color="auto"/>
+                  </w:tcBorders>
+                </w:tcPr>
+                <w:p>
+                  <w:pPr>
+                    <w:pStyle w:val="Compact"/>
+                  </w:pPr>
+                </w:p>
+              </w:tc>
+              <w:tc>
+                <w:tcPr>
+                  <w:tcW w:w="1962" w:type="dxa"/>
+                  <w:tcBorders>
+                    <w:top w:val="double" w:sz="4" w:space="0" w:color="auto"/>
+                    <w:bottom w:val="single" w:sz="12" w:space="0" w:color="auto"/>
+                  </w:tcBorders>
                 </w:tcPr>
                 <w:p>
                   <w:pPr>
@@ -2406,7 +2673,11 @@
             <w:tr>
               <w:tc>
                 <w:tcPr>
-                  <w:tcW w:w="1377" w:type="dxa"/>
+                  <w:tcW w:w="1570" w:type="dxa"/>
+                  <w:tcBorders>
+                    <w:top w:val="single" w:sz="12" w:space="0" w:color="auto"/>
+                    <w:bottom w:val="single" w:sz="4" w:space="0" w:color="auto"/>
+                  </w:tcBorders>
                 </w:tcPr>
                 <w:p>
                   <w:pPr>
@@ -2420,7 +2691,11 @@
               </w:tc>
               <w:tc>
                 <w:tcPr>
-                  <w:tcW w:w="1377" w:type="dxa"/>
+                  <w:tcW w:w="1570" w:type="dxa"/>
+                  <w:tcBorders>
+                    <w:top w:val="single" w:sz="12" w:space="0" w:color="auto"/>
+                    <w:bottom w:val="single" w:sz="4" w:space="0" w:color="auto"/>
+                  </w:tcBorders>
                 </w:tcPr>
                 <w:p>
                   <w:pPr>
@@ -2434,7 +2709,11 @@
               </w:tc>
               <w:tc>
                 <w:tcPr>
-                  <w:tcW w:w="1721" w:type="dxa"/>
+                  <w:tcW w:w="1962" w:type="dxa"/>
+                  <w:tcBorders>
+                    <w:top w:val="single" w:sz="12" w:space="0" w:color="auto"/>
+                    <w:bottom w:val="single" w:sz="4" w:space="0" w:color="auto"/>
+                  </w:tcBorders>
                 </w:tcPr>
                 <w:p>
                   <w:pPr>
@@ -2448,7 +2727,11 @@
               </w:tc>
               <w:tc>
                 <w:tcPr>
-                  <w:tcW w:w="1721" w:type="dxa"/>
+                  <w:tcW w:w="1962" w:type="dxa"/>
+                  <w:tcBorders>
+                    <w:top w:val="single" w:sz="12" w:space="0" w:color="auto"/>
+                    <w:bottom w:val="single" w:sz="4" w:space="0" w:color="auto"/>
+                  </w:tcBorders>
                 </w:tcPr>
                 <w:p>
                   <w:pPr>
@@ -2462,7 +2745,11 @@
               </w:tc>
               <w:tc>
                 <w:tcPr>
-                  <w:tcW w:w="1721" w:type="dxa"/>
+                  <w:tcW w:w="1962" w:type="dxa"/>
+                  <w:tcBorders>
+                    <w:top w:val="single" w:sz="12" w:space="0" w:color="auto"/>
+                    <w:bottom w:val="single" w:sz="4" w:space="0" w:color="auto"/>
+                  </w:tcBorders>
                 </w:tcPr>
                 <w:p>
                   <w:pPr>
@@ -2478,7 +2765,10 @@
             <w:tr>
               <w:tc>
                 <w:tcPr>
-                  <w:tcW w:w="1377" w:type="dxa"/>
+                  <w:tcW w:w="1570" w:type="dxa"/>
+                  <w:tcBorders>
+                    <w:top w:val="single" w:sz="4" w:space="0" w:color="auto"/>
+                  </w:tcBorders>
                 </w:tcPr>
                 <w:p>
                   <w:pPr>
@@ -2492,7 +2782,10 @@
               </w:tc>
               <w:tc>
                 <w:tcPr>
-                  <w:tcW w:w="1377" w:type="dxa"/>
+                  <w:tcW w:w="1570" w:type="dxa"/>
+                  <w:tcBorders>
+                    <w:top w:val="single" w:sz="4" w:space="0" w:color="auto"/>
+                  </w:tcBorders>
                 </w:tcPr>
                 <w:p>
                   <w:pPr>
@@ -2506,7 +2799,10 @@
               </w:tc>
               <w:tc>
                 <w:tcPr>
-                  <w:tcW w:w="1721" w:type="dxa"/>
+                  <w:tcW w:w="1962" w:type="dxa"/>
+                  <w:tcBorders>
+                    <w:top w:val="single" w:sz="4" w:space="0" w:color="auto"/>
+                  </w:tcBorders>
                 </w:tcPr>
                 <w:p>
                   <w:pPr>
@@ -2520,7 +2816,10 @@
               </w:tc>
               <w:tc>
                 <w:tcPr>
-                  <w:tcW w:w="1721" w:type="dxa"/>
+                  <w:tcW w:w="1962" w:type="dxa"/>
+                  <w:tcBorders>
+                    <w:top w:val="single" w:sz="4" w:space="0" w:color="auto"/>
+                  </w:tcBorders>
                 </w:tcPr>
                 <w:p>
                   <w:pPr>
@@ -2534,7 +2833,10 @@
               </w:tc>
               <w:tc>
                 <w:tcPr>
-                  <w:tcW w:w="1721" w:type="dxa"/>
+                  <w:tcW w:w="1962" w:type="dxa"/>
+                  <w:tcBorders>
+                    <w:top w:val="single" w:sz="4" w:space="0" w:color="auto"/>
+                  </w:tcBorders>
                 </w:tcPr>
                 <w:p>
                   <w:pPr>
@@ -2553,6 +2855,11 @@
         </w:tc>
       </w:tr>
     </w:tbl>
+    <w:p>
+      <w:pPr>
+        <w:pStyle w:val="BodyText"/>
+      </w:pPr>
+    </w:p>
     <w:p>
       <w:pPr>
         <w:pStyle w:val="BodyText"/>
@@ -2609,8 +2916,8 @@
                 <w:noProof/>
               </w:rPr>
               <w:drawing>
-                <wp:inline distT="0" distB="0" distL="0" distR="0" wp14:anchorId="5EDD681B" wp14:editId="4B3FB935">
-                  <wp:extent cx="5846618" cy="3026455"/>
+                <wp:inline distT="0" distB="0" distL="0" distR="0" wp14:anchorId="5E82BFF6" wp14:editId="23BDA74D">
+                  <wp:extent cx="5783530" cy="3029527"/>
                   <wp:effectExtent l="0" t="0" r="0" b="0"/>
                   <wp:docPr id="41" name="Picture"/>
                   <wp:cNvGraphicFramePr/>
@@ -2625,7 +2932,7 @@
                         </pic:nvPicPr>
                         <pic:blipFill rotWithShape="1">
                           <a:blip r:embed="rId14"/>
-                          <a:srcRect l="1262"/>
+                          <a:srcRect l="1129" r="1297"/>
                           <a:stretch>
                             <a:fillRect/>
                           </a:stretch>
@@ -2633,7 +2940,7 @@
                         <pic:spPr bwMode="auto">
                           <a:xfrm>
                             <a:off x="0" y="0"/>
-                            <a:ext cx="5911319" cy="3059947"/>
+                            <a:ext cx="5801498" cy="3038939"/>
                           </a:xfrm>
                           <a:prstGeom prst="rect">
                             <a:avLst/>
@@ -2675,6 +2982,7 @@
           <w:p>
             <w:pPr>
               <w:pStyle w:val="Compact"/>
+              <w:jc w:val="center"/>
             </w:pPr>
             <w:bookmarkStart w:id="20" w:name="fig-umap"/>
           </w:p>
@@ -2693,15 +3001,15 @@
           <w:p>
             <w:pPr>
               <w:pStyle w:val="Compact"/>
-              <w:jc w:val="left"/>
+              <w:jc w:val="center"/>
             </w:pPr>
             <w:r>
               <w:rPr>
                 <w:noProof/>
               </w:rPr>
               <w:drawing>
-                <wp:inline distT="0" distB="0" distL="0" distR="0" wp14:anchorId="7C3EA6F7" wp14:editId="1E42BBC9">
-                  <wp:extent cx="5928337" cy="2636520"/>
+                <wp:inline distT="0" distB="0" distL="0" distR="0" wp14:anchorId="199D3911" wp14:editId="515F9EE5">
+                  <wp:extent cx="6022109" cy="2694255"/>
                   <wp:effectExtent l="0" t="0" r="0" b="0"/>
                   <wp:docPr id="45" name="Picture"/>
                   <wp:cNvGraphicFramePr/>
@@ -2716,7 +3024,7 @@
                         </pic:nvPicPr>
                         <pic:blipFill rotWithShape="1">
                           <a:blip r:embed="rId15"/>
-                          <a:srcRect l="1836"/>
+                          <a:srcRect l="2420"/>
                           <a:stretch>
                             <a:fillRect/>
                           </a:stretch>
@@ -2724,7 +3032,7 @@
                         <pic:spPr bwMode="auto">
                           <a:xfrm>
                             <a:off x="0" y="0"/>
-                            <a:ext cx="6004824" cy="2670536"/>
+                            <a:ext cx="6090390" cy="2724804"/>
                           </a:xfrm>
                           <a:prstGeom prst="rect">
                             <a:avLst/>
@@ -2816,7 +3124,7 @@
                 <w:noProof/>
               </w:rPr>
               <w:drawing>
-                <wp:inline distT="0" distB="0" distL="0" distR="0" wp14:anchorId="0E97E614" wp14:editId="74623B6B">
+                <wp:inline distT="0" distB="0" distL="0" distR="0" wp14:anchorId="6C032025" wp14:editId="4EF51B29">
                   <wp:extent cx="5727700" cy="4739901"/>
                   <wp:effectExtent l="0" t="0" r="0" b="0"/>
                   <wp:docPr id="49" name="Picture"/>
@@ -2968,7 +3276,10 @@
               </w:trPr>
               <w:tc>
                 <w:tcPr>
-                  <w:tcW w:w="1377" w:type="dxa"/>
+                  <w:tcW w:w="1570" w:type="dxa"/>
+                  <w:tcBorders>
+                    <w:bottom w:val="single" w:sz="12" w:space="0" w:color="auto"/>
+                  </w:tcBorders>
                 </w:tcPr>
                 <w:p>
                   <w:pPr>
@@ -2982,7 +3293,10 @@
               </w:tc>
               <w:tc>
                 <w:tcPr>
-                  <w:tcW w:w="1377" w:type="dxa"/>
+                  <w:tcW w:w="1570" w:type="dxa"/>
+                  <w:tcBorders>
+                    <w:bottom w:val="single" w:sz="12" w:space="0" w:color="auto"/>
+                  </w:tcBorders>
                 </w:tcPr>
                 <w:p>
                   <w:pPr>
@@ -2996,7 +3310,10 @@
               </w:tc>
               <w:tc>
                 <w:tcPr>
-                  <w:tcW w:w="1721" w:type="dxa"/>
+                  <w:tcW w:w="1962" w:type="dxa"/>
+                  <w:tcBorders>
+                    <w:bottom w:val="single" w:sz="12" w:space="0" w:color="auto"/>
+                  </w:tcBorders>
                 </w:tcPr>
                 <w:p>
                   <w:pPr>
@@ -3010,7 +3327,10 @@
               </w:tc>
               <w:tc>
                 <w:tcPr>
-                  <w:tcW w:w="1721" w:type="dxa"/>
+                  <w:tcW w:w="1962" w:type="dxa"/>
+                  <w:tcBorders>
+                    <w:bottom w:val="single" w:sz="12" w:space="0" w:color="auto"/>
+                  </w:tcBorders>
                 </w:tcPr>
                 <w:p>
                   <w:pPr>
@@ -3024,7 +3344,10 @@
               </w:tc>
               <w:tc>
                 <w:tcPr>
-                  <w:tcW w:w="1721" w:type="dxa"/>
+                  <w:tcW w:w="1962" w:type="dxa"/>
+                  <w:tcBorders>
+                    <w:bottom w:val="single" w:sz="12" w:space="0" w:color="auto"/>
+                  </w:tcBorders>
                 </w:tcPr>
                 <w:p>
                   <w:pPr>
@@ -3040,21 +3363,41 @@
             <w:tr>
               <w:tc>
                 <w:tcPr>
-                  <w:tcW w:w="1377" w:type="dxa"/>
-                </w:tcPr>
-                <w:p>
-                  <w:pPr>
-                    <w:pStyle w:val="Compact"/>
-                    <w:jc w:val="center"/>
-                  </w:pPr>
-                  <w:r>
-                    <w:t>DinoBloom-S (ViT)</w:t>
-                  </w:r>
-                </w:p>
-              </w:tc>
-              <w:tc>
-                <w:tcPr>
-                  <w:tcW w:w="1377" w:type="dxa"/>
+                  <w:tcW w:w="1570" w:type="dxa"/>
+                  <w:vMerge w:val="restart"/>
+                  <w:tcBorders>
+                    <w:top w:val="single" w:sz="12" w:space="0" w:color="auto"/>
+                  </w:tcBorders>
+                </w:tcPr>
+                <w:p>
+                  <w:pPr>
+                    <w:pStyle w:val="Compact"/>
+                    <w:jc w:val="center"/>
+                  </w:pPr>
+                  <w:proofErr w:type="spellStart"/>
+                  <w:r>
+                    <w:t>DinoBloom</w:t>
+                  </w:r>
+                  <w:proofErr w:type="spellEnd"/>
+                  <w:r>
+                    <w:t>-S (</w:t>
+                  </w:r>
+                  <w:proofErr w:type="spellStart"/>
+                  <w:r>
+                    <w:t>ViT</w:t>
+                  </w:r>
+                  <w:proofErr w:type="spellEnd"/>
+                  <w:r>
+                    <w:t>)</w:t>
+                  </w:r>
+                </w:p>
+              </w:tc>
+              <w:tc>
+                <w:tcPr>
+                  <w:tcW w:w="1570" w:type="dxa"/>
+                  <w:tcBorders>
+                    <w:top w:val="single" w:sz="12" w:space="0" w:color="auto"/>
+                  </w:tcBorders>
                 </w:tcPr>
                 <w:p>
                   <w:pPr>
@@ -3068,7 +3411,10 @@
               </w:tc>
               <w:tc>
                 <w:tcPr>
-                  <w:tcW w:w="1721" w:type="dxa"/>
+                  <w:tcW w:w="1962" w:type="dxa"/>
+                  <w:tcBorders>
+                    <w:top w:val="single" w:sz="12" w:space="0" w:color="auto"/>
+                  </w:tcBorders>
                 </w:tcPr>
                 <w:p>
                   <w:pPr>
@@ -3086,7 +3432,10 @@
               </w:tc>
               <w:tc>
                 <w:tcPr>
-                  <w:tcW w:w="1721" w:type="dxa"/>
+                  <w:tcW w:w="1962" w:type="dxa"/>
+                  <w:tcBorders>
+                    <w:top w:val="single" w:sz="12" w:space="0" w:color="auto"/>
+                  </w:tcBorders>
                 </w:tcPr>
                 <w:p>
                   <w:pPr>
@@ -3104,7 +3453,10 @@
               </w:tc>
               <w:tc>
                 <w:tcPr>
-                  <w:tcW w:w="1721" w:type="dxa"/>
+                  <w:tcW w:w="1962" w:type="dxa"/>
+                  <w:tcBorders>
+                    <w:top w:val="single" w:sz="12" w:space="0" w:color="auto"/>
+                  </w:tcBorders>
                 </w:tcPr>
                 <w:p>
                   <w:pPr>
@@ -3124,17 +3476,24 @@
             <w:tr>
               <w:tc>
                 <w:tcPr>
-                  <w:tcW w:w="1377" w:type="dxa"/>
-                </w:tcPr>
-                <w:p>
-                  <w:pPr>
-                    <w:pStyle w:val="Compact"/>
-                  </w:pPr>
-                </w:p>
-              </w:tc>
-              <w:tc>
-                <w:tcPr>
-                  <w:tcW w:w="1377" w:type="dxa"/>
+                  <w:tcW w:w="1570" w:type="dxa"/>
+                  <w:vMerge/>
+                  <w:tcBorders>
+                    <w:bottom w:val="single" w:sz="4" w:space="0" w:color="auto"/>
+                  </w:tcBorders>
+                </w:tcPr>
+                <w:p>
+                  <w:pPr>
+                    <w:pStyle w:val="Compact"/>
+                  </w:pPr>
+                </w:p>
+              </w:tc>
+              <w:tc>
+                <w:tcPr>
+                  <w:tcW w:w="1570" w:type="dxa"/>
+                  <w:tcBorders>
+                    <w:bottom w:val="single" w:sz="4" w:space="0" w:color="auto"/>
+                  </w:tcBorders>
                 </w:tcPr>
                 <w:p>
                   <w:pPr>
@@ -3148,7 +3507,10 @@
               </w:tc>
               <w:tc>
                 <w:tcPr>
-                  <w:tcW w:w="1721" w:type="dxa"/>
+                  <w:tcW w:w="1962" w:type="dxa"/>
+                  <w:tcBorders>
+                    <w:bottom w:val="single" w:sz="4" w:space="0" w:color="auto"/>
+                  </w:tcBorders>
                 </w:tcPr>
                 <w:p>
                   <w:pPr>
@@ -3162,7 +3524,10 @@
               </w:tc>
               <w:tc>
                 <w:tcPr>
-                  <w:tcW w:w="1721" w:type="dxa"/>
+                  <w:tcW w:w="1962" w:type="dxa"/>
+                  <w:tcBorders>
+                    <w:bottom w:val="single" w:sz="4" w:space="0" w:color="auto"/>
+                  </w:tcBorders>
                 </w:tcPr>
                 <w:p>
                   <w:pPr>
@@ -3176,7 +3541,10 @@
               </w:tc>
               <w:tc>
                 <w:tcPr>
-                  <w:tcW w:w="1721" w:type="dxa"/>
+                  <w:tcW w:w="1962" w:type="dxa"/>
+                  <w:tcBorders>
+                    <w:bottom w:val="single" w:sz="4" w:space="0" w:color="auto"/>
+                  </w:tcBorders>
                 </w:tcPr>
                 <w:p>
                   <w:pPr>
@@ -3192,7 +3560,11 @@
             <w:tr>
               <w:tc>
                 <w:tcPr>
-                  <w:tcW w:w="1377" w:type="dxa"/>
+                  <w:tcW w:w="1570" w:type="dxa"/>
+                  <w:vMerge w:val="restart"/>
+                  <w:tcBorders>
+                    <w:top w:val="single" w:sz="4" w:space="0" w:color="auto"/>
+                  </w:tcBorders>
                 </w:tcPr>
                 <w:p>
                   <w:pPr>
@@ -3206,7 +3578,10 @@
               </w:tc>
               <w:tc>
                 <w:tcPr>
-                  <w:tcW w:w="1377" w:type="dxa"/>
+                  <w:tcW w:w="1570" w:type="dxa"/>
+                  <w:tcBorders>
+                    <w:top w:val="single" w:sz="4" w:space="0" w:color="auto"/>
+                  </w:tcBorders>
                 </w:tcPr>
                 <w:p>
                   <w:pPr>
@@ -3220,7 +3595,10 @@
               </w:tc>
               <w:tc>
                 <w:tcPr>
-                  <w:tcW w:w="1721" w:type="dxa"/>
+                  <w:tcW w:w="1962" w:type="dxa"/>
+                  <w:tcBorders>
+                    <w:top w:val="single" w:sz="4" w:space="0" w:color="auto"/>
+                  </w:tcBorders>
                 </w:tcPr>
                 <w:p>
                   <w:pPr>
@@ -3234,7 +3612,10 @@
               </w:tc>
               <w:tc>
                 <w:tcPr>
-                  <w:tcW w:w="1721" w:type="dxa"/>
+                  <w:tcW w:w="1962" w:type="dxa"/>
+                  <w:tcBorders>
+                    <w:top w:val="single" w:sz="4" w:space="0" w:color="auto"/>
+                  </w:tcBorders>
                 </w:tcPr>
                 <w:p>
                   <w:pPr>
@@ -3248,7 +3629,10 @@
               </w:tc>
               <w:tc>
                 <w:tcPr>
-                  <w:tcW w:w="1721" w:type="dxa"/>
+                  <w:tcW w:w="1962" w:type="dxa"/>
+                  <w:tcBorders>
+                    <w:top w:val="single" w:sz="4" w:space="0" w:color="auto"/>
+                  </w:tcBorders>
                 </w:tcPr>
                 <w:p>
                   <w:pPr>
@@ -3264,17 +3648,24 @@
             <w:tr>
               <w:tc>
                 <w:tcPr>
-                  <w:tcW w:w="1377" w:type="dxa"/>
-                </w:tcPr>
-                <w:p>
-                  <w:pPr>
-                    <w:pStyle w:val="Compact"/>
-                  </w:pPr>
-                </w:p>
-              </w:tc>
-              <w:tc>
-                <w:tcPr>
-                  <w:tcW w:w="1377" w:type="dxa"/>
+                  <w:tcW w:w="1570" w:type="dxa"/>
+                  <w:vMerge/>
+                  <w:tcBorders>
+                    <w:bottom w:val="single" w:sz="4" w:space="0" w:color="auto"/>
+                  </w:tcBorders>
+                </w:tcPr>
+                <w:p>
+                  <w:pPr>
+                    <w:pStyle w:val="Compact"/>
+                  </w:pPr>
+                </w:p>
+              </w:tc>
+              <w:tc>
+                <w:tcPr>
+                  <w:tcW w:w="1570" w:type="dxa"/>
+                  <w:tcBorders>
+                    <w:bottom w:val="single" w:sz="4" w:space="0" w:color="auto"/>
+                  </w:tcBorders>
                 </w:tcPr>
                 <w:p>
                   <w:pPr>
@@ -3288,7 +3679,10 @@
               </w:tc>
               <w:tc>
                 <w:tcPr>
-                  <w:tcW w:w="1721" w:type="dxa"/>
+                  <w:tcW w:w="1962" w:type="dxa"/>
+                  <w:tcBorders>
+                    <w:bottom w:val="single" w:sz="4" w:space="0" w:color="auto"/>
+                  </w:tcBorders>
                 </w:tcPr>
                 <w:p>
                   <w:pPr>
@@ -3302,7 +3696,10 @@
               </w:tc>
               <w:tc>
                 <w:tcPr>
-                  <w:tcW w:w="1721" w:type="dxa"/>
+                  <w:tcW w:w="1962" w:type="dxa"/>
+                  <w:tcBorders>
+                    <w:bottom w:val="single" w:sz="4" w:space="0" w:color="auto"/>
+                  </w:tcBorders>
                 </w:tcPr>
                 <w:p>
                   <w:pPr>
@@ -3316,7 +3713,10 @@
               </w:tc>
               <w:tc>
                 <w:tcPr>
-                  <w:tcW w:w="1721" w:type="dxa"/>
+                  <w:tcW w:w="1962" w:type="dxa"/>
+                  <w:tcBorders>
+                    <w:bottom w:val="single" w:sz="4" w:space="0" w:color="auto"/>
+                  </w:tcBorders>
                 </w:tcPr>
                 <w:p>
                   <w:pPr>
@@ -3332,21 +3732,36 @@
             <w:tr>
               <w:tc>
                 <w:tcPr>
-                  <w:tcW w:w="1377" w:type="dxa"/>
-                </w:tcPr>
-                <w:p>
-                  <w:pPr>
-                    <w:pStyle w:val="Compact"/>
-                    <w:jc w:val="center"/>
-                  </w:pPr>
-                  <w:r>
-                    <w:t>Handcrafted (CellPose)</w:t>
-                  </w:r>
-                </w:p>
-              </w:tc>
-              <w:tc>
-                <w:tcPr>
-                  <w:tcW w:w="1377" w:type="dxa"/>
+                  <w:tcW w:w="1570" w:type="dxa"/>
+                  <w:vMerge w:val="restart"/>
+                  <w:tcBorders>
+                    <w:top w:val="single" w:sz="4" w:space="0" w:color="auto"/>
+                  </w:tcBorders>
+                </w:tcPr>
+                <w:p>
+                  <w:pPr>
+                    <w:pStyle w:val="Compact"/>
+                    <w:jc w:val="center"/>
+                  </w:pPr>
+                  <w:r>
+                    <w:t>Handcrafted (</w:t>
+                  </w:r>
+                  <w:proofErr w:type="spellStart"/>
+                  <w:r>
+                    <w:t>CellPose</w:t>
+                  </w:r>
+                  <w:proofErr w:type="spellEnd"/>
+                  <w:r>
+                    <w:t>)</w:t>
+                  </w:r>
+                </w:p>
+              </w:tc>
+              <w:tc>
+                <w:tcPr>
+                  <w:tcW w:w="1570" w:type="dxa"/>
+                  <w:tcBorders>
+                    <w:top w:val="single" w:sz="4" w:space="0" w:color="auto"/>
+                  </w:tcBorders>
                 </w:tcPr>
                 <w:p>
                   <w:pPr>
@@ -3360,7 +3775,10 @@
               </w:tc>
               <w:tc>
                 <w:tcPr>
-                  <w:tcW w:w="1721" w:type="dxa"/>
+                  <w:tcW w:w="1962" w:type="dxa"/>
+                  <w:tcBorders>
+                    <w:top w:val="single" w:sz="4" w:space="0" w:color="auto"/>
+                  </w:tcBorders>
                 </w:tcPr>
                 <w:p>
                   <w:pPr>
@@ -3374,7 +3792,10 @@
               </w:tc>
               <w:tc>
                 <w:tcPr>
-                  <w:tcW w:w="1721" w:type="dxa"/>
+                  <w:tcW w:w="1962" w:type="dxa"/>
+                  <w:tcBorders>
+                    <w:top w:val="single" w:sz="4" w:space="0" w:color="auto"/>
+                  </w:tcBorders>
                 </w:tcPr>
                 <w:p>
                   <w:pPr>
@@ -3388,7 +3809,10 @@
               </w:tc>
               <w:tc>
                 <w:tcPr>
-                  <w:tcW w:w="1721" w:type="dxa"/>
+                  <w:tcW w:w="1962" w:type="dxa"/>
+                  <w:tcBorders>
+                    <w:top w:val="single" w:sz="4" w:space="0" w:color="auto"/>
+                  </w:tcBorders>
                 </w:tcPr>
                 <w:p>
                   <w:pPr>
@@ -3404,17 +3828,24 @@
             <w:tr>
               <w:tc>
                 <w:tcPr>
-                  <w:tcW w:w="1377" w:type="dxa"/>
-                </w:tcPr>
-                <w:p>
-                  <w:pPr>
-                    <w:pStyle w:val="Compact"/>
-                  </w:pPr>
-                </w:p>
-              </w:tc>
-              <w:tc>
-                <w:tcPr>
-                  <w:tcW w:w="1377" w:type="dxa"/>
+                  <w:tcW w:w="1570" w:type="dxa"/>
+                  <w:vMerge/>
+                  <w:tcBorders>
+                    <w:bottom w:val="single" w:sz="4" w:space="0" w:color="auto"/>
+                  </w:tcBorders>
+                </w:tcPr>
+                <w:p>
+                  <w:pPr>
+                    <w:pStyle w:val="Compact"/>
+                  </w:pPr>
+                </w:p>
+              </w:tc>
+              <w:tc>
+                <w:tcPr>
+                  <w:tcW w:w="1570" w:type="dxa"/>
+                  <w:tcBorders>
+                    <w:bottom w:val="single" w:sz="4" w:space="0" w:color="auto"/>
+                  </w:tcBorders>
                 </w:tcPr>
                 <w:p>
                   <w:pPr>
@@ -3428,7 +3859,10 @@
               </w:tc>
               <w:tc>
                 <w:tcPr>
-                  <w:tcW w:w="1721" w:type="dxa"/>
+                  <w:tcW w:w="1962" w:type="dxa"/>
+                  <w:tcBorders>
+                    <w:bottom w:val="single" w:sz="4" w:space="0" w:color="auto"/>
+                  </w:tcBorders>
                 </w:tcPr>
                 <w:p>
                   <w:pPr>
@@ -3442,7 +3876,10 @@
               </w:tc>
               <w:tc>
                 <w:tcPr>
-                  <w:tcW w:w="1721" w:type="dxa"/>
+                  <w:tcW w:w="1962" w:type="dxa"/>
+                  <w:tcBorders>
+                    <w:bottom w:val="single" w:sz="4" w:space="0" w:color="auto"/>
+                  </w:tcBorders>
                 </w:tcPr>
                 <w:p>
                   <w:pPr>
@@ -3456,7 +3893,10 @@
               </w:tc>
               <w:tc>
                 <w:tcPr>
-                  <w:tcW w:w="1721" w:type="dxa"/>
+                  <w:tcW w:w="1962" w:type="dxa"/>
+                  <w:tcBorders>
+                    <w:bottom w:val="single" w:sz="4" w:space="0" w:color="auto"/>
+                  </w:tcBorders>
                 </w:tcPr>
                 <w:p>
                   <w:pPr>
@@ -3472,7 +3912,11 @@
             <w:tr>
               <w:tc>
                 <w:tcPr>
-                  <w:tcW w:w="1377" w:type="dxa"/>
+                  <w:tcW w:w="1570" w:type="dxa"/>
+                  <w:vMerge w:val="restart"/>
+                  <w:tcBorders>
+                    <w:top w:val="single" w:sz="4" w:space="0" w:color="auto"/>
+                  </w:tcBorders>
                 </w:tcPr>
                 <w:p>
                   <w:pPr>
@@ -3486,7 +3930,10 @@
               </w:tc>
               <w:tc>
                 <w:tcPr>
-                  <w:tcW w:w="1377" w:type="dxa"/>
+                  <w:tcW w:w="1570" w:type="dxa"/>
+                  <w:tcBorders>
+                    <w:top w:val="single" w:sz="4" w:space="0" w:color="auto"/>
+                  </w:tcBorders>
                 </w:tcPr>
                 <w:p>
                   <w:pPr>
@@ -3500,7 +3947,10 @@
               </w:tc>
               <w:tc>
                 <w:tcPr>
-                  <w:tcW w:w="1721" w:type="dxa"/>
+                  <w:tcW w:w="1962" w:type="dxa"/>
+                  <w:tcBorders>
+                    <w:top w:val="single" w:sz="4" w:space="0" w:color="auto"/>
+                  </w:tcBorders>
                 </w:tcPr>
                 <w:p>
                   <w:pPr>
@@ -3514,7 +3964,10 @@
               </w:tc>
               <w:tc>
                 <w:tcPr>
-                  <w:tcW w:w="1721" w:type="dxa"/>
+                  <w:tcW w:w="1962" w:type="dxa"/>
+                  <w:tcBorders>
+                    <w:top w:val="single" w:sz="4" w:space="0" w:color="auto"/>
+                  </w:tcBorders>
                 </w:tcPr>
                 <w:p>
                   <w:pPr>
@@ -3528,7 +3981,10 @@
               </w:tc>
               <w:tc>
                 <w:tcPr>
-                  <w:tcW w:w="1721" w:type="dxa"/>
+                  <w:tcW w:w="1962" w:type="dxa"/>
+                  <w:tcBorders>
+                    <w:top w:val="single" w:sz="4" w:space="0" w:color="auto"/>
+                  </w:tcBorders>
                 </w:tcPr>
                 <w:p>
                   <w:pPr>
@@ -3544,17 +4000,24 @@
             <w:tr>
               <w:tc>
                 <w:tcPr>
-                  <w:tcW w:w="1377" w:type="dxa"/>
-                </w:tcPr>
-                <w:p>
-                  <w:pPr>
-                    <w:pStyle w:val="Compact"/>
-                  </w:pPr>
-                </w:p>
-              </w:tc>
-              <w:tc>
-                <w:tcPr>
-                  <w:tcW w:w="1377" w:type="dxa"/>
+                  <w:tcW w:w="1570" w:type="dxa"/>
+                  <w:vMerge/>
+                  <w:tcBorders>
+                    <w:bottom w:val="single" w:sz="4" w:space="0" w:color="auto"/>
+                  </w:tcBorders>
+                </w:tcPr>
+                <w:p>
+                  <w:pPr>
+                    <w:pStyle w:val="Compact"/>
+                  </w:pPr>
+                </w:p>
+              </w:tc>
+              <w:tc>
+                <w:tcPr>
+                  <w:tcW w:w="1570" w:type="dxa"/>
+                  <w:tcBorders>
+                    <w:bottom w:val="single" w:sz="4" w:space="0" w:color="auto"/>
+                  </w:tcBorders>
                 </w:tcPr>
                 <w:p>
                   <w:pPr>
@@ -3568,7 +4031,10 @@
               </w:tc>
               <w:tc>
                 <w:tcPr>
-                  <w:tcW w:w="1721" w:type="dxa"/>
+                  <w:tcW w:w="1962" w:type="dxa"/>
+                  <w:tcBorders>
+                    <w:bottom w:val="single" w:sz="4" w:space="0" w:color="auto"/>
+                  </w:tcBorders>
                 </w:tcPr>
                 <w:p>
                   <w:pPr>
@@ -3582,7 +4048,10 @@
               </w:tc>
               <w:tc>
                 <w:tcPr>
-                  <w:tcW w:w="1721" w:type="dxa"/>
+                  <w:tcW w:w="1962" w:type="dxa"/>
+                  <w:tcBorders>
+                    <w:bottom w:val="single" w:sz="4" w:space="0" w:color="auto"/>
+                  </w:tcBorders>
                 </w:tcPr>
                 <w:p>
                   <w:pPr>
@@ -3596,7 +4065,10 @@
               </w:tc>
               <w:tc>
                 <w:tcPr>
-                  <w:tcW w:w="1721" w:type="dxa"/>
+                  <w:tcW w:w="1962" w:type="dxa"/>
+                  <w:tcBorders>
+                    <w:bottom w:val="single" w:sz="4" w:space="0" w:color="auto"/>
+                  </w:tcBorders>
                 </w:tcPr>
                 <w:p>
                   <w:pPr>
@@ -3612,21 +4084,41 @@
             <w:tr>
               <w:tc>
                 <w:tcPr>
-                  <w:tcW w:w="1377" w:type="dxa"/>
-                </w:tcPr>
-                <w:p>
-                  <w:pPr>
-                    <w:pStyle w:val="Compact"/>
-                    <w:jc w:val="center"/>
-                  </w:pPr>
-                  <w:r>
-                    <w:t>ViT-S/16 (ViT)</w:t>
-                  </w:r>
-                </w:p>
-              </w:tc>
-              <w:tc>
-                <w:tcPr>
-                  <w:tcW w:w="1377" w:type="dxa"/>
+                  <w:tcW w:w="1570" w:type="dxa"/>
+                  <w:vMerge w:val="restart"/>
+                  <w:tcBorders>
+                    <w:top w:val="single" w:sz="4" w:space="0" w:color="auto"/>
+                  </w:tcBorders>
+                </w:tcPr>
+                <w:p>
+                  <w:pPr>
+                    <w:pStyle w:val="Compact"/>
+                    <w:jc w:val="center"/>
+                  </w:pPr>
+                  <w:proofErr w:type="spellStart"/>
+                  <w:r>
+                    <w:t>ViT</w:t>
+                  </w:r>
+                  <w:proofErr w:type="spellEnd"/>
+                  <w:r>
+                    <w:t>-S/16 (</w:t>
+                  </w:r>
+                  <w:proofErr w:type="spellStart"/>
+                  <w:r>
+                    <w:t>ViT</w:t>
+                  </w:r>
+                  <w:proofErr w:type="spellEnd"/>
+                  <w:r>
+                    <w:t>)</w:t>
+                  </w:r>
+                </w:p>
+              </w:tc>
+              <w:tc>
+                <w:tcPr>
+                  <w:tcW w:w="1570" w:type="dxa"/>
+                  <w:tcBorders>
+                    <w:top w:val="single" w:sz="4" w:space="0" w:color="auto"/>
+                  </w:tcBorders>
                 </w:tcPr>
                 <w:p>
                   <w:pPr>
@@ -3640,7 +4132,10 @@
               </w:tc>
               <w:tc>
                 <w:tcPr>
-                  <w:tcW w:w="1721" w:type="dxa"/>
+                  <w:tcW w:w="1962" w:type="dxa"/>
+                  <w:tcBorders>
+                    <w:top w:val="single" w:sz="4" w:space="0" w:color="auto"/>
+                  </w:tcBorders>
                 </w:tcPr>
                 <w:p>
                   <w:pPr>
@@ -3654,7 +4149,10 @@
               </w:tc>
               <w:tc>
                 <w:tcPr>
-                  <w:tcW w:w="1721" w:type="dxa"/>
+                  <w:tcW w:w="1962" w:type="dxa"/>
+                  <w:tcBorders>
+                    <w:top w:val="single" w:sz="4" w:space="0" w:color="auto"/>
+                  </w:tcBorders>
                 </w:tcPr>
                 <w:p>
                   <w:pPr>
@@ -3668,7 +4166,10 @@
               </w:tc>
               <w:tc>
                 <w:tcPr>
-                  <w:tcW w:w="1721" w:type="dxa"/>
+                  <w:tcW w:w="1962" w:type="dxa"/>
+                  <w:tcBorders>
+                    <w:top w:val="single" w:sz="4" w:space="0" w:color="auto"/>
+                  </w:tcBorders>
                 </w:tcPr>
                 <w:p>
                   <w:pPr>
@@ -3684,17 +4185,24 @@
             <w:tr>
               <w:tc>
                 <w:tcPr>
-                  <w:tcW w:w="1377" w:type="dxa"/>
-                </w:tcPr>
-                <w:p>
-                  <w:pPr>
-                    <w:pStyle w:val="Compact"/>
-                  </w:pPr>
-                </w:p>
-              </w:tc>
-              <w:tc>
-                <w:tcPr>
-                  <w:tcW w:w="1377" w:type="dxa"/>
+                  <w:tcW w:w="1570" w:type="dxa"/>
+                  <w:vMerge/>
+                  <w:tcBorders>
+                    <w:bottom w:val="single" w:sz="4" w:space="0" w:color="auto"/>
+                  </w:tcBorders>
+                </w:tcPr>
+                <w:p>
+                  <w:pPr>
+                    <w:pStyle w:val="Compact"/>
+                  </w:pPr>
+                </w:p>
+              </w:tc>
+              <w:tc>
+                <w:tcPr>
+                  <w:tcW w:w="1570" w:type="dxa"/>
+                  <w:tcBorders>
+                    <w:bottom w:val="single" w:sz="4" w:space="0" w:color="auto"/>
+                  </w:tcBorders>
                 </w:tcPr>
                 <w:p>
                   <w:pPr>
@@ -3708,7 +4216,10 @@
               </w:tc>
               <w:tc>
                 <w:tcPr>
-                  <w:tcW w:w="1721" w:type="dxa"/>
+                  <w:tcW w:w="1962" w:type="dxa"/>
+                  <w:tcBorders>
+                    <w:bottom w:val="single" w:sz="4" w:space="0" w:color="auto"/>
+                  </w:tcBorders>
                 </w:tcPr>
                 <w:p>
                   <w:pPr>
@@ -3722,7 +4233,10 @@
               </w:tc>
               <w:tc>
                 <w:tcPr>
-                  <w:tcW w:w="1721" w:type="dxa"/>
+                  <w:tcW w:w="1962" w:type="dxa"/>
+                  <w:tcBorders>
+                    <w:bottom w:val="single" w:sz="4" w:space="0" w:color="auto"/>
+                  </w:tcBorders>
                 </w:tcPr>
                 <w:p>
                   <w:pPr>
@@ -3736,7 +4250,10 @@
               </w:tc>
               <w:tc>
                 <w:tcPr>
-                  <w:tcW w:w="1721" w:type="dxa"/>
+                  <w:tcW w:w="1962" w:type="dxa"/>
+                  <w:tcBorders>
+                    <w:bottom w:val="single" w:sz="4" w:space="0" w:color="auto"/>
+                  </w:tcBorders>
                 </w:tcPr>
                 <w:p>
                   <w:pPr>
@@ -3752,7 +4269,11 @@
             <w:tr>
               <w:tc>
                 <w:tcPr>
-                  <w:tcW w:w="1377" w:type="dxa"/>
+                  <w:tcW w:w="1570" w:type="dxa"/>
+                  <w:vMerge w:val="restart"/>
+                  <w:tcBorders>
+                    <w:top w:val="single" w:sz="4" w:space="0" w:color="auto"/>
+                  </w:tcBorders>
                 </w:tcPr>
                 <w:p>
                   <w:pPr>
@@ -3766,7 +4287,10 @@
               </w:tc>
               <w:tc>
                 <w:tcPr>
-                  <w:tcW w:w="1377" w:type="dxa"/>
+                  <w:tcW w:w="1570" w:type="dxa"/>
+                  <w:tcBorders>
+                    <w:top w:val="single" w:sz="4" w:space="0" w:color="auto"/>
+                  </w:tcBorders>
                 </w:tcPr>
                 <w:p>
                   <w:pPr>
@@ -3780,7 +4304,10 @@
               </w:tc>
               <w:tc>
                 <w:tcPr>
-                  <w:tcW w:w="1721" w:type="dxa"/>
+                  <w:tcW w:w="1962" w:type="dxa"/>
+                  <w:tcBorders>
+                    <w:top w:val="single" w:sz="4" w:space="0" w:color="auto"/>
+                  </w:tcBorders>
                 </w:tcPr>
                 <w:p>
                   <w:pPr>
@@ -3794,7 +4321,10 @@
               </w:tc>
               <w:tc>
                 <w:tcPr>
-                  <w:tcW w:w="1721" w:type="dxa"/>
+                  <w:tcW w:w="1962" w:type="dxa"/>
+                  <w:tcBorders>
+                    <w:top w:val="single" w:sz="4" w:space="0" w:color="auto"/>
+                  </w:tcBorders>
                 </w:tcPr>
                 <w:p>
                   <w:pPr>
@@ -3808,7 +4338,10 @@
               </w:tc>
               <w:tc>
                 <w:tcPr>
-                  <w:tcW w:w="1721" w:type="dxa"/>
+                  <w:tcW w:w="1962" w:type="dxa"/>
+                  <w:tcBorders>
+                    <w:top w:val="single" w:sz="4" w:space="0" w:color="auto"/>
+                  </w:tcBorders>
                 </w:tcPr>
                 <w:p>
                   <w:pPr>
@@ -3824,17 +4357,18 @@
             <w:tr>
               <w:tc>
                 <w:tcPr>
-                  <w:tcW w:w="1377" w:type="dxa"/>
-                </w:tcPr>
-                <w:p>
-                  <w:pPr>
-                    <w:pStyle w:val="Compact"/>
-                  </w:pPr>
-                </w:p>
-              </w:tc>
-              <w:tc>
-                <w:tcPr>
-                  <w:tcW w:w="1377" w:type="dxa"/>
+                  <w:tcW w:w="1570" w:type="dxa"/>
+                  <w:vMerge/>
+                </w:tcPr>
+                <w:p>
+                  <w:pPr>
+                    <w:pStyle w:val="Compact"/>
+                  </w:pPr>
+                </w:p>
+              </w:tc>
+              <w:tc>
+                <w:tcPr>
+                  <w:tcW w:w="1570" w:type="dxa"/>
                 </w:tcPr>
                 <w:p>
                   <w:pPr>
@@ -3848,7 +4382,7 @@
               </w:tc>
               <w:tc>
                 <w:tcPr>
-                  <w:tcW w:w="1721" w:type="dxa"/>
+                  <w:tcW w:w="1962" w:type="dxa"/>
                 </w:tcPr>
                 <w:p>
                   <w:pPr>
@@ -3862,7 +4396,7 @@
               </w:tc>
               <w:tc>
                 <w:tcPr>
-                  <w:tcW w:w="1721" w:type="dxa"/>
+                  <w:tcW w:w="1962" w:type="dxa"/>
                 </w:tcPr>
                 <w:p>
                   <w:pPr>
@@ -3876,7 +4410,7 @@
               </w:tc>
               <w:tc>
                 <w:tcPr>
-                  <w:tcW w:w="1721" w:type="dxa"/>
+                  <w:tcW w:w="1962" w:type="dxa"/>
                 </w:tcPr>
                 <w:p>
                   <w:pPr>
@@ -3923,24 +4457,12 @@
               <w:pStyle w:val="Compact"/>
               <w:jc w:val="center"/>
             </w:pPr>
-          </w:p>
-          <w:p>
-            <w:pPr>
-              <w:pStyle w:val="Compact"/>
-              <w:jc w:val="center"/>
-            </w:pPr>
-          </w:p>
-          <w:p>
-            <w:pPr>
-              <w:pStyle w:val="Compact"/>
-              <w:jc w:val="center"/>
-            </w:pPr>
             <w:r>
               <w:rPr>
                 <w:noProof/>
               </w:rPr>
               <w:drawing>
-                <wp:inline distT="0" distB="0" distL="0" distR="0" wp14:anchorId="778E73E0" wp14:editId="2F0049E5">
+                <wp:inline distT="0" distB="0" distL="0" distR="0" wp14:anchorId="2C1FC724" wp14:editId="5A278259">
                   <wp:extent cx="5727700" cy="2917963"/>
                   <wp:effectExtent l="0" t="0" r="0" b="0"/>
                   <wp:docPr id="54" name="Picture"/>
@@ -3999,6 +4521,16 @@
       <w:pPr>
         <w:pStyle w:val="BodyText"/>
       </w:pPr>
+    </w:p>
+    <w:p>
+      <w:pPr>
+        <w:pStyle w:val="BodyText"/>
+      </w:pPr>
+    </w:p>
+    <w:p>
+      <w:pPr>
+        <w:pStyle w:val="BodyText"/>
+      </w:pPr>
       <w:r>
         <w:t>The unexpected finding during external validation was the effect of cell segmentation on handcrafted features (</w:t>
       </w:r>
@@ -4033,11 +4565,11 @@
         </w:r>
       </w:hyperlink>
       <w:r>
-        <w:t xml:space="preserve"> c, d) shows that both approaches shared nucleus GLCM texture features in their top 10, as expected given </w:t>
+        <w:t xml:space="preserve"> c, d) shows that both approaches shared nucleus GLCM texture features in their top 10, as expected given identical nucleus segmentation. The difference is that convex hull leaned more on cytoplasm-to-cell colour ratios, while CellPose leaned more on nucleus-to-cell colour ratios and shape features such as solidity. This could be due to the convex hull of the nucleus </w:t>
       </w:r>
       <w:r>
         <w:lastRenderedPageBreak/>
-        <w:t>identical nucleus segmentation. The difference is that convex hull leaned more on cytoplasm-to-cell colour ratios, while CellPose leaned more on nucleus-to-cell colour ratios and shape features such as solidity. This could be due to the convex hull of the nucleus underestimating the true cell boundary, yielding a thin cytoplasmic region surrounding the nucleus. Colour ratios computed from this small region are sensitive to boundary detection and lack the averaging effect of a larger sample of pixels. In contrast, CellPose traces the actual cell membrane, providing a fuller cytoplasm region where pixel-level noise is averaged out, producing more stable colour ratios that generalise across scanners.</w:t>
+        <w:t>underestimating the true cell boundary, yielding a thin cytoplasmic region surrounding the nucleus. Colour ratios computed from this small region are sensitive to boundary detection and lack the averaging effect of a larger sample of pixels. In contrast, CellPose traces the actual cell membrane, providing a fuller cytoplasm region where pixel-level noise is averaged out, producing more stable colour ratios that generalise across scanners.</w:t>
       </w:r>
     </w:p>
     <w:tbl>
@@ -4066,7 +4598,7 @@
                 <w:noProof/>
               </w:rPr>
               <w:drawing>
-                <wp:inline distT="0" distB="0" distL="0" distR="0" wp14:anchorId="391F90DC" wp14:editId="0B052A62">
+                <wp:inline distT="0" distB="0" distL="0" distR="0" wp14:anchorId="38C07B1B" wp14:editId="4B3F8E6E">
                   <wp:extent cx="5727700" cy="5823092"/>
                   <wp:effectExtent l="0" t="0" r="0" b="0"/>
                   <wp:docPr id="58" name="Picture"/>
@@ -4127,6 +4659,24 @@
       </w:pPr>
       <w:bookmarkStart w:id="25" w:name="discussion"/>
       <w:bookmarkEnd w:id="17"/>
+    </w:p>
+    <w:p>
+      <w:pPr>
+        <w:rPr>
+          <w:rFonts w:asciiTheme="majorHAnsi" w:eastAsiaTheme="majorEastAsia" w:hAnsiTheme="majorHAnsi" w:cstheme="majorBidi"/>
+          <w:color w:val="0072B2"/>
+          <w:sz w:val="40"/>
+          <w:szCs w:val="40"/>
+        </w:rPr>
+      </w:pPr>
+      <w:r>
+        <w:br w:type="page"/>
+      </w:r>
+    </w:p>
+    <w:p>
+      <w:pPr>
+        <w:pStyle w:val="Heading1"/>
+      </w:pPr>
       <w:r>
         <w:lastRenderedPageBreak/>
         <w:t>Discussion</w:t>
@@ -4936,7 +5486,18 @@
         <w:t>Proceedings of the 25th ACM SIGKDD international conference on knowledge discovery and data mining</w:t>
       </w:r>
       <w:r>
-        <w:t xml:space="preserve"> (2019).</w:t>
+        <w:t xml:space="preserve"> (2019). doi:</w:t>
+      </w:r>
+      <w:hyperlink r:id="rId32">
+        <w:r>
+          <w:rPr>
+            <w:rStyle w:val="Hyperlink"/>
+          </w:rPr>
+          <w:t>10.1145/3292500.3330701</w:t>
+        </w:r>
+      </w:hyperlink>
+      <w:r>
+        <w:t>.</w:t>
       </w:r>
     </w:p>
     <w:p>
@@ -4952,7 +5513,7 @@
         <w:tab/>
         <w:t xml:space="preserve">Glüge, S., Balabanov, S., Koelzer, V. H. &amp; Ott, T. </w:t>
       </w:r>
-      <w:hyperlink r:id="rId32">
+      <w:hyperlink r:id="rId33">
         <w:r>
           <w:rPr>
             <w:rStyle w:val="Hyperlink"/>
@@ -5028,22 +5589,22 @@
                 <w:noProof/>
               </w:rPr>
               <w:drawing>
-                <wp:inline distT="0" distB="0" distL="0" distR="0" wp14:anchorId="603798A3" wp14:editId="4FE79768">
+                <wp:inline distT="0" distB="0" distL="0" distR="0" wp14:anchorId="6047E0B5" wp14:editId="40847C49">
                   <wp:extent cx="5727700" cy="7854050"/>
                   <wp:effectExtent l="0" t="0" r="0" b="0"/>
-                  <wp:docPr id="95" name="Picture"/>
+                  <wp:docPr id="96" name="Picture"/>
                   <wp:cNvGraphicFramePr/>
                   <a:graphic xmlns:a="http://schemas.openxmlformats.org/drawingml/2006/main">
                     <a:graphicData uri="http://schemas.openxmlformats.org/drawingml/2006/picture">
                       <pic:pic xmlns:pic="http://schemas.openxmlformats.org/drawingml/2006/picture">
                         <pic:nvPicPr>
-                          <pic:cNvPr id="96" name="Picture" descr="HDS_05_YuChungYan_2605_files/figure-docx/fig-segmentation-comparison-output-1.png"/>
+                          <pic:cNvPr id="97" name="Picture" descr="HDS_05_YuChungYan_2605_files/figure-docx/fig-segmentation-comparison-output-1.png"/>
                           <pic:cNvPicPr>
                             <a:picLocks noChangeAspect="1" noChangeArrowheads="1"/>
                           </pic:cNvPicPr>
                         </pic:nvPicPr>
                         <pic:blipFill>
-                          <a:blip r:embed="rId33"/>
+                          <a:blip r:embed="rId34"/>
                           <a:stretch>
                             <a:fillRect/>
                           </a:stretch>
@@ -5103,7 +5664,7 @@
   <w:abstractNum w:abstractNumId="0" w15:restartNumberingAfterBreak="0">
     <w:nsid w:val="0000A990"/>
     <w:multiLevelType w:val="multilevel"/>
-    <w:tmpl w:val="377E6CF0"/>
+    <w:tmpl w:val="3D983B48"/>
     <w:lvl w:ilvl="0">
       <w:numFmt w:val="bullet"/>
       <w:lvlText w:val=" "/>
@@ -5180,7 +5741,7 @@
   <w:abstractNum w:abstractNumId="1" w15:restartNumberingAfterBreak="0">
     <w:nsid w:val="0000A991"/>
     <w:multiLevelType w:val="multilevel"/>
-    <w:tmpl w:val="4F8C226C"/>
+    <w:tmpl w:val="D58854DE"/>
     <w:lvl w:ilvl="0">
       <w:numFmt w:val="bullet"/>
       <w:lvlText w:val=""/>
@@ -5284,7 +5845,7 @@
   <w:abstractNum w:abstractNumId="2" w15:restartNumberingAfterBreak="0">
     <w:nsid w:val="00A99411"/>
     <w:multiLevelType w:val="multilevel"/>
-    <w:tmpl w:val="37F2AC48"/>
+    <w:tmpl w:val="071047B2"/>
     <w:lvl w:ilvl="0">
       <w:start w:val="1"/>
       <w:numFmt w:val="decimal"/>
@@ -5370,7 +5931,7 @@
   <w:abstractNum w:abstractNumId="3" w15:restartNumberingAfterBreak="0">
     <w:nsid w:val="00A99412"/>
     <w:multiLevelType w:val="multilevel"/>
-    <w:tmpl w:val="79567A5C"/>
+    <w:tmpl w:val="84AC1B1A"/>
     <w:lvl w:ilvl="0">
       <w:start w:val="2"/>
       <w:numFmt w:val="decimal"/>
@@ -5456,7 +6017,7 @@
   <w:abstractNum w:abstractNumId="4" w15:restartNumberingAfterBreak="0">
     <w:nsid w:val="00A99413"/>
     <w:multiLevelType w:val="multilevel"/>
-    <w:tmpl w:val="DEF615D6"/>
+    <w:tmpl w:val="43046620"/>
     <w:lvl w:ilvl="0">
       <w:start w:val="3"/>
       <w:numFmt w:val="decimal"/>
@@ -5542,7 +6103,7 @@
   <w:abstractNum w:abstractNumId="5" w15:restartNumberingAfterBreak="0">
     <w:nsid w:val="00A99414"/>
     <w:multiLevelType w:val="multilevel"/>
-    <w:tmpl w:val="88F24238"/>
+    <w:tmpl w:val="A216D8FC"/>
     <w:lvl w:ilvl="0">
       <w:start w:val="4"/>
       <w:numFmt w:val="decimal"/>
@@ -5628,7 +6189,7 @@
   <w:abstractNum w:abstractNumId="6" w15:restartNumberingAfterBreak="0">
     <w:nsid w:val="00A99415"/>
     <w:multiLevelType w:val="multilevel"/>
-    <w:tmpl w:val="6302CAB0"/>
+    <w:tmpl w:val="23EC7D06"/>
     <w:lvl w:ilvl="0">
       <w:start w:val="5"/>
       <w:numFmt w:val="decimal"/>
@@ -5818,10 +6379,10 @@
   <w:num w:numId="1" w16cid:durableId="605238415">
     <w:abstractNumId w:val="7"/>
   </w:num>
-  <w:num w:numId="2" w16cid:durableId="840463209">
+  <w:num w:numId="2" w16cid:durableId="1010183112">
     <w:abstractNumId w:val="0"/>
   </w:num>
-  <w:num w:numId="3" w16cid:durableId="1443188195">
+  <w:num w:numId="3" w16cid:durableId="2044594405">
     <w:abstractNumId w:val="2"/>
     <w:lvlOverride w:ilvl="0">
       <w:startOverride w:val="1"/>
@@ -5851,10 +6412,10 @@
       <w:startOverride w:val="1"/>
     </w:lvlOverride>
   </w:num>
-  <w:num w:numId="4" w16cid:durableId="1810785992">
+  <w:num w:numId="4" w16cid:durableId="1521049849">
     <w:abstractNumId w:val="1"/>
   </w:num>
-  <w:num w:numId="5" w16cid:durableId="993224180">
+  <w:num w:numId="5" w16cid:durableId="1818187446">
     <w:abstractNumId w:val="3"/>
     <w:lvlOverride w:ilvl="0">
       <w:startOverride w:val="2"/>
@@ -5884,10 +6445,10 @@
       <w:startOverride w:val="2"/>
     </w:lvlOverride>
   </w:num>
-  <w:num w:numId="6" w16cid:durableId="1246644072">
+  <w:num w:numId="6" w16cid:durableId="1603993717">
     <w:abstractNumId w:val="1"/>
   </w:num>
-  <w:num w:numId="7" w16cid:durableId="692920216">
+  <w:num w:numId="7" w16cid:durableId="1195071634">
     <w:abstractNumId w:val="4"/>
     <w:lvlOverride w:ilvl="0">
       <w:startOverride w:val="3"/>
@@ -5917,10 +6478,10 @@
       <w:startOverride w:val="3"/>
     </w:lvlOverride>
   </w:num>
-  <w:num w:numId="8" w16cid:durableId="671572041">
+  <w:num w:numId="8" w16cid:durableId="390470770">
     <w:abstractNumId w:val="1"/>
   </w:num>
-  <w:num w:numId="9" w16cid:durableId="1369525972">
+  <w:num w:numId="9" w16cid:durableId="1464932095">
     <w:abstractNumId w:val="5"/>
     <w:lvlOverride w:ilvl="0">
       <w:startOverride w:val="4"/>
@@ -5950,10 +6511,10 @@
       <w:startOverride w:val="4"/>
     </w:lvlOverride>
   </w:num>
-  <w:num w:numId="10" w16cid:durableId="1562786212">
+  <w:num w:numId="10" w16cid:durableId="315884896">
     <w:abstractNumId w:val="1"/>
   </w:num>
-  <w:num w:numId="11" w16cid:durableId="1889996006">
+  <w:num w:numId="11" w16cid:durableId="743727354">
     <w:abstractNumId w:val="6"/>
     <w:lvlOverride w:ilvl="0">
       <w:startOverride w:val="5"/>
@@ -5983,7 +6544,7 @@
       <w:startOverride w:val="5"/>
     </w:lvlOverride>
   </w:num>
-  <w:num w:numId="12" w16cid:durableId="1771655564">
+  <w:num w:numId="12" w16cid:durableId="223180294">
     <w:abstractNumId w:val="1"/>
   </w:num>
 </w:numbering>

</xml_diff>

<commit_message>
fix: Add repo link after abstract
</commit_message>
<xml_diff>
--- a/report/HDS_05_YuChungYan_2606.docx
+++ b/report/HDS_05_YuChungYan_2606.docx
@@ -740,8 +740,46 @@
         <w:t>CONCLUSION</w:t>
       </w:r>
       <w:r>
-        <w:t xml:space="preserve"> Domain-specific self-supervised pretraining (DinoBloom-S) paired with a lightweight classifier provides near fine-tuned performance at a fraction of the computational cost. Segmentation quality plays a role for handcrafted feature generalisability.</w:t>
-      </w:r>
+        <w:t xml:space="preserve"> Domain-specific self-supervised pretraining (DinoBloom-S) paired with a lightweight classifier provides near fine-tuned performance at a fraction of the computational cost. Segmentation quality plays a role for handcrafted feature </w:t>
+      </w:r>
+      <w:proofErr w:type="spellStart"/>
+      <w:r>
+        <w:t>generalisability</w:t>
+      </w:r>
+      <w:proofErr w:type="spellEnd"/>
+      <w:r>
+        <w:t>.</w:t>
+      </w:r>
+    </w:p>
+    <w:p>
+      <w:pPr>
+        <w:pStyle w:val="BodyText"/>
+      </w:pPr>
+      <w:r>
+        <w:t xml:space="preserve">Project repository: </w:t>
+      </w:r>
+      <w:hyperlink r:id="rId7" w:history="1">
+        <w:r>
+          <w:rPr>
+            <w:rStyle w:val="Hyperlink"/>
+          </w:rPr>
+          <w:t>github.com/</w:t>
+        </w:r>
+        <w:proofErr w:type="spellStart"/>
+        <w:r>
+          <w:rPr>
+            <w:rStyle w:val="Hyperlink"/>
+          </w:rPr>
+          <w:t>joelyu</w:t>
+        </w:r>
+        <w:proofErr w:type="spellEnd"/>
+        <w:r>
+          <w:rPr>
+            <w:rStyle w:val="Hyperlink"/>
+          </w:rPr>
+          <w:t>/HDS-W5.git</w:t>
+        </w:r>
+      </w:hyperlink>
     </w:p>
     <w:p>
       <w:pPr>
@@ -886,7 +924,7 @@
       <w:r>
         <w:t xml:space="preserve">The </w:t>
       </w:r>
-      <w:hyperlink r:id="rId7">
+      <w:hyperlink r:id="rId8">
         <w:r>
           <w:rPr>
             <w:rStyle w:val="Hyperlink"/>
@@ -967,7 +1005,7 @@
                           </pic:cNvPicPr>
                         </pic:nvPicPr>
                         <pic:blipFill>
-                          <a:blip r:embed="rId8"/>
+                          <a:blip r:embed="rId9"/>
                           <a:stretch>
                             <a:fillRect/>
                           </a:stretch>
@@ -1038,7 +1076,7 @@
                           </pic:cNvPicPr>
                         </pic:nvPicPr>
                         <pic:blipFill>
-                          <a:blip r:embed="rId9"/>
+                          <a:blip r:embed="rId10"/>
                           <a:stretch>
                             <a:fillRect/>
                           </a:stretch>
@@ -1227,7 +1265,7 @@
       <w:r>
         <w:t xml:space="preserve">An </w:t>
       </w:r>
-      <w:hyperlink r:id="rId10">
+      <w:hyperlink r:id="rId11">
         <w:r>
           <w:rPr>
             <w:rStyle w:val="Hyperlink"/>
@@ -1274,7 +1312,7 @@
       <w:r>
         <w:t xml:space="preserve">The code for this project is available on GitHub in this </w:t>
       </w:r>
-      <w:hyperlink r:id="rId11">
+      <w:hyperlink r:id="rId12">
         <w:r>
           <w:rPr>
             <w:rStyle w:val="Hyperlink"/>
@@ -1303,7 +1341,7 @@
       <w:r>
         <w:t xml:space="preserve"> script reproduces the full pipeline. Datasets and model weights are auto-downloaded via scripts from </w:t>
       </w:r>
-      <w:hyperlink r:id="rId12">
+      <w:hyperlink r:id="rId13">
         <w:r>
           <w:rPr>
             <w:rStyle w:val="Hyperlink"/>
@@ -1314,7 +1352,7 @@
       <w:r>
         <w:t xml:space="preserve">, </w:t>
       </w:r>
-      <w:hyperlink r:id="rId13">
+      <w:hyperlink r:id="rId14">
         <w:r>
           <w:rPr>
             <w:rStyle w:val="Hyperlink"/>
@@ -2931,7 +2969,7 @@
                           </pic:cNvPicPr>
                         </pic:nvPicPr>
                         <pic:blipFill rotWithShape="1">
-                          <a:blip r:embed="rId14"/>
+                          <a:blip r:embed="rId15"/>
                           <a:srcRect l="1129" r="1297"/>
                           <a:stretch>
                             <a:fillRect/>
@@ -3023,7 +3061,7 @@
                           </pic:cNvPicPr>
                         </pic:nvPicPr>
                         <pic:blipFill rotWithShape="1">
-                          <a:blip r:embed="rId15"/>
+                          <a:blip r:embed="rId16"/>
                           <a:srcRect l="2420"/>
                           <a:stretch>
                             <a:fillRect/>
@@ -3139,7 +3177,7 @@
                           </pic:cNvPicPr>
                         </pic:nvPicPr>
                         <pic:blipFill>
-                          <a:blip r:embed="rId16"/>
+                          <a:blip r:embed="rId17"/>
                           <a:stretch>
                             <a:fillRect/>
                           </a:stretch>
@@ -4477,7 +4515,7 @@
                           </pic:cNvPicPr>
                         </pic:nvPicPr>
                         <pic:blipFill>
-                          <a:blip r:embed="rId17"/>
+                          <a:blip r:embed="rId18"/>
                           <a:stretch>
                             <a:fillRect/>
                           </a:stretch>
@@ -4613,7 +4651,7 @@
                           </pic:cNvPicPr>
                         </pic:nvPicPr>
                         <pic:blipFill>
-                          <a:blip r:embed="rId18"/>
+                          <a:blip r:embed="rId19"/>
                           <a:stretch>
                             <a:fillRect/>
                           </a:stretch>
@@ -4877,7 +4915,7 @@
         <w:tab/>
         <w:t xml:space="preserve">Acevedo, A., Alférez, S., Merino, A., Puigví, L. &amp; Rodellar, J. </w:t>
       </w:r>
-      <w:hyperlink r:id="rId19">
+      <w:hyperlink r:id="rId20">
         <w:r>
           <w:rPr>
             <w:rStyle w:val="Hyperlink"/>
@@ -4932,7 +4970,7 @@
       <w:r>
         <w:t xml:space="preserve"> </w:t>
       </w:r>
-      <w:hyperlink r:id="rId20">
+      <w:hyperlink r:id="rId21">
         <w:r>
           <w:rPr>
             <w:rStyle w:val="Hyperlink"/>
@@ -4987,7 +5025,7 @@
       <w:r>
         <w:t xml:space="preserve"> </w:t>
       </w:r>
-      <w:hyperlink r:id="rId21">
+      <w:hyperlink r:id="rId22">
         <w:r>
           <w:rPr>
             <w:rStyle w:val="Hyperlink"/>
@@ -5032,7 +5070,7 @@
         <w:tab/>
         <w:t xml:space="preserve">Tavakoli, S., Ghaffari, A., Kouzehkanan, Z. M. &amp; Hosseini, R. </w:t>
       </w:r>
-      <w:hyperlink r:id="rId22">
+      <w:hyperlink r:id="rId23">
         <w:r>
           <w:rPr>
             <w:rStyle w:val="Hyperlink"/>
@@ -5087,7 +5125,7 @@
       <w:r>
         <w:t xml:space="preserve"> </w:t>
       </w:r>
-      <w:hyperlink r:id="rId23">
+      <w:hyperlink r:id="rId24">
         <w:r>
           <w:rPr>
             <w:rStyle w:val="Hyperlink"/>
@@ -5122,7 +5160,7 @@
         <w:tab/>
         <w:t xml:space="preserve">Asghar, R., Kumar, S., Shaukat, A. &amp; Hynds, P. </w:t>
       </w:r>
-      <w:hyperlink r:id="rId24">
+      <w:hyperlink r:id="rId25">
         <w:r>
           <w:rPr>
             <w:rStyle w:val="Hyperlink"/>
@@ -5177,7 +5215,7 @@
       <w:r>
         <w:t xml:space="preserve"> </w:t>
       </w:r>
-      <w:hyperlink r:id="rId25">
+      <w:hyperlink r:id="rId26">
         <w:r>
           <w:rPr>
             <w:rStyle w:val="Hyperlink"/>
@@ -5232,7 +5270,7 @@
       <w:r>
         <w:t xml:space="preserve"> </w:t>
       </w:r>
-      <w:hyperlink r:id="rId26">
+      <w:hyperlink r:id="rId27">
         <w:r>
           <w:rPr>
             <w:rStyle w:val="Hyperlink"/>
@@ -5287,7 +5325,7 @@
       <w:r>
         <w:t xml:space="preserve"> </w:t>
       </w:r>
-      <w:hyperlink r:id="rId27">
+      <w:hyperlink r:id="rId28">
         <w:r>
           <w:rPr>
             <w:rStyle w:val="Hyperlink"/>
@@ -5342,7 +5380,7 @@
       <w:r>
         <w:t xml:space="preserve"> </w:t>
       </w:r>
-      <w:hyperlink r:id="rId28">
+      <w:hyperlink r:id="rId29">
         <w:r>
           <w:rPr>
             <w:rStyle w:val="Hyperlink"/>
@@ -5387,7 +5425,7 @@
         <w:tab/>
         <w:t xml:space="preserve">Dasariraju, S., Huo, M. &amp; McCalla, S. </w:t>
       </w:r>
-      <w:hyperlink r:id="rId29">
+      <w:hyperlink r:id="rId30">
         <w:r>
           <w:rPr>
             <w:rStyle w:val="Hyperlink"/>
@@ -5442,7 +5480,7 @@
       <w:r>
         <w:t xml:space="preserve"> </w:t>
       </w:r>
-      <w:hyperlink r:id="rId30">
+      <w:hyperlink r:id="rId31">
         <w:r>
           <w:rPr>
             <w:rStyle w:val="Hyperlink"/>
@@ -5453,7 +5491,7 @@
       <w:r>
         <w:t xml:space="preserve"> (2025) doi:</w:t>
       </w:r>
-      <w:hyperlink r:id="rId31">
+      <w:hyperlink r:id="rId32">
         <w:r>
           <w:rPr>
             <w:rStyle w:val="Hyperlink"/>
@@ -5488,7 +5526,7 @@
       <w:r>
         <w:t xml:space="preserve"> (2019). doi:</w:t>
       </w:r>
-      <w:hyperlink r:id="rId32">
+      <w:hyperlink r:id="rId33">
         <w:r>
           <w:rPr>
             <w:rStyle w:val="Hyperlink"/>
@@ -5513,7 +5551,7 @@
         <w:tab/>
         <w:t xml:space="preserve">Glüge, S., Balabanov, S., Koelzer, V. H. &amp; Ott, T. </w:t>
       </w:r>
-      <w:hyperlink r:id="rId33">
+      <w:hyperlink r:id="rId34">
         <w:r>
           <w:rPr>
             <w:rStyle w:val="Hyperlink"/>
@@ -5604,7 +5642,7 @@
                           </pic:cNvPicPr>
                         </pic:nvPicPr>
                         <pic:blipFill>
-                          <a:blip r:embed="rId34"/>
+                          <a:blip r:embed="rId35"/>
                           <a:stretch>
                             <a:fillRect/>
                           </a:stretch>
@@ -7827,6 +7865,18 @@
       <w:color w:val="003B4F"/>
       <w:sz w:val="22"/>
       <w:shd w:val="clear" w:color="auto" w:fill="F1F3F5"/>
+    </w:rPr>
+  </w:style>
+  <w:style w:type="character" w:styleId="UnresolvedMention">
+    <w:name w:val="Unresolved Mention"/>
+    <w:basedOn w:val="DefaultParagraphFont"/>
+    <w:uiPriority w:val="99"/>
+    <w:semiHidden/>
+    <w:unhideWhenUsed/>
+    <w:rsid w:val="000F1893"/>
+    <w:rPr>
+      <w:color w:val="605E5C"/>
+      <w:shd w:val="clear" w:color="auto" w:fill="E1DFDD"/>
     </w:rPr>
   </w:style>
 </w:styles>

</xml_diff>